<commit_message>
added introduction and endnotes
</commit_message>
<xml_diff>
--- a/Лабораторна_робота_1_експертна_система.docx
+++ b/Лабораторна_робота_1_експертна_система.docx
@@ -1177,13 +1177,42 @@
     </w:p>
     <w:p>
       <w:pPr>
-        <w:pStyle w:val="a6"/>
+        <w:pStyle w:val="a7"/>
         <w:spacing w:after="0"/>
+        <w:rPr>
+          <w:rFonts w:hint="eastAsia"/>
+          <w:lang w:eastAsia="ja-JP"/>
+        </w:rPr>
       </w:pPr>
       <w:bookmarkStart w:id="0" w:name="_Toc242178467"/>
       <w:r>
+        <w:rPr>
+          <w:rFonts w:hint="eastAsia"/>
+          <w:lang w:eastAsia="ja-JP"/>
+        </w:rPr>
         <w:lastRenderedPageBreak/>
-        <w:t>Вступ</w:t>
+        <w:t>В</w:t>
+      </w:r>
+      <w:r>
+        <w:rPr>
+          <w:rFonts w:hint="eastAsia"/>
+          <w:lang w:eastAsia="ja-JP"/>
+        </w:rPr>
+        <w:t>с</w:t>
+      </w:r>
+      <w:r>
+        <w:rPr>
+          <w:rFonts w:hint="eastAsia"/>
+          <w:lang w:eastAsia="ja-JP"/>
+        </w:rPr>
+        <w:t>Т</w:t>
+      </w:r>
+      <w:r>
+        <w:rPr>
+          <w:rFonts w:hint="eastAsia"/>
+          <w:lang w:eastAsia="ja-JP"/>
+        </w:rPr>
+        <w:t>уп</w:t>
       </w:r>
       <w:bookmarkEnd w:id="0"/>
     </w:p>
@@ -1197,12 +1226,207 @@
         <w:rPr>
           <w:lang w:val="uk-UA"/>
         </w:rPr>
-        <w:t xml:space="preserve">Авававва </w:t>
-      </w:r>
-    </w:p>
-    <w:p>
-      <w:pPr>
-        <w:pStyle w:val="a6"/>
+        <w:t>У сучасних умовах розвитку інформаційних технологій важливе значення має автоматизація процесів аналізу даних, прийняття рішень та діагностики технічних систем. Одним із засобів розв’язання таких завдань є експертні системи, які дають змогу формалізувати знання предметної області та використовувати їх для отримання логічних висновків на основі відомих фактів.</w:t>
+      </w:r>
+    </w:p>
+    <w:p>
+      <w:pPr>
+        <w:rPr>
+          <w:lang w:val="uk-UA"/>
+        </w:rPr>
+      </w:pPr>
+      <w:r>
+        <w:rPr>
+          <w:lang w:val="uk-UA"/>
+        </w:rPr>
+        <w:t xml:space="preserve">Експертні системи продукційного типу є одним із підходів до подання знань, за якого інформація описується у формі правил виду «ЯКЩО </w:t>
+      </w:r>
+      <w:r>
+        <w:rPr>
+          <w:lang w:val="uk-UA"/>
+        </w:rPr>
+        <w:t>–</w:t>
+      </w:r>
+      <w:r>
+        <w:rPr>
+          <w:lang w:val="uk-UA"/>
+        </w:rPr>
+        <w:t xml:space="preserve"> ТО». Такі правила визначають умови, за яких наявні факти можуть бути використані для формування нових висновків. Важливою складовою таких систем є механізм логічного виведення, який забезпечує послідовне застосування правил відповідно до поточного стану робочої пам’яті.</w:t>
+      </w:r>
+    </w:p>
+    <w:p>
+      <w:pPr>
+        <w:rPr>
+          <w:lang w:val="uk-UA"/>
+        </w:rPr>
+      </w:pPr>
+      <w:r>
+        <w:rPr>
+          <w:lang w:val="uk-UA"/>
+        </w:rPr>
+        <w:t>Одним із поширених способів логічного виведення є пряме виведення, яке передбачає початок процесу з відомих фактів та послідовне отримання нових фактів шляхом застосування відповідних правил. Такий підхід дає змогу реалізувати автоматизований аналіз ситуацій, у яких необхідно визначити можливі причини проблем на основі спостережуваних ознак.</w:t>
+      </w:r>
+    </w:p>
+    <w:p>
+      <w:pPr>
+        <w:rPr>
+          <w:lang w:val="uk-UA"/>
+        </w:rPr>
+      </w:pPr>
+      <w:r>
+        <w:rPr>
+          <w:lang w:val="uk-UA"/>
+        </w:rPr>
+        <w:t>У цій лабораторній роботі предметною областю обрано первинну діагностику типових несправностей персонального комп’ютера. Аналізуються такі ознаки, як наявність живлення, робота вентиляторів, наявність сигналу на дисплеї, завантаження операційної системи, виявлення накопичувача та доступність мережі. На основі цих даних формується база продукційних правил, за допомогою якої система визначає можливі проблеми.</w:t>
+      </w:r>
+    </w:p>
+    <w:p>
+      <w:pPr>
+        <w:rPr>
+          <w:lang w:val="uk-UA"/>
+        </w:rPr>
+      </w:pPr>
+      <w:r>
+        <w:rPr>
+          <w:lang w:val="uk-UA"/>
+        </w:rPr>
+        <w:t xml:space="preserve">Для реалізації експертної системи використовується мова програмування Python. Програмна реалізація передбачає створення структури для зберігання продукційних правил, організацію робочої пам’яті, використання черги для послідовного опрацювання фактів і формування протоколу логічних висновків. Це </w:t>
+      </w:r>
+      <w:r>
+        <w:rPr>
+          <w:lang w:val="uk-UA"/>
+        </w:rPr>
+        <w:lastRenderedPageBreak/>
+        <w:t>дає змогу не лише отримувати результат діагностики, а й простежувати послідовність застосування правил, що привели до відповідного висновку.</w:t>
+      </w:r>
+    </w:p>
+    <w:p>
+      <w:pPr>
+        <w:rPr>
+          <w:lang w:val="uk-UA"/>
+        </w:rPr>
+      </w:pPr>
+      <w:r>
+        <w:rPr>
+          <w:lang w:val="uk-UA"/>
+        </w:rPr>
+        <w:t>Метою лабораторної роботи є вивчення принципів побудови експертних систем продукційного типу та розроблення програмної реалізації механізму прямого логічного виведення для первинної діагностики типових несправностей персонального комп’ютера.</w:t>
+      </w:r>
+    </w:p>
+    <w:p>
+      <w:pPr>
+        <w:rPr>
+          <w:lang w:val="uk-UA"/>
+        </w:rPr>
+      </w:pPr>
+      <w:r>
+        <w:rPr>
+          <w:lang w:val="uk-UA"/>
+        </w:rPr>
+        <w:t>Для досягнення поставленої мети необхідно виконати такі завдання</w:t>
+      </w:r>
+      <w:r>
+        <w:rPr>
+          <w:rFonts w:eastAsiaTheme="minorEastAsia" w:hint="eastAsia"/>
+          <w:lang w:val="uk-UA" w:eastAsia="ja-JP"/>
+        </w:rPr>
+        <w:t xml:space="preserve"> </w:t>
+      </w:r>
+      <w:r>
+        <w:rPr>
+          <w:lang w:val="uk-UA"/>
+        </w:rPr>
+        <w:t>дослідити структуру та основні компоненти експертної системи продукційного типу</w:t>
+      </w:r>
+      <w:r>
+        <w:rPr>
+          <w:lang w:val="uk-UA"/>
+        </w:rPr>
+        <w:t>,</w:t>
+      </w:r>
+      <w:r>
+        <w:rPr>
+          <w:rFonts w:eastAsiaTheme="minorEastAsia" w:hint="eastAsia"/>
+          <w:lang w:val="uk-UA" w:eastAsia="ja-JP"/>
+        </w:rPr>
+        <w:t xml:space="preserve"> </w:t>
+      </w:r>
+      <w:r>
+        <w:rPr>
+          <w:lang w:val="uk-UA"/>
+        </w:rPr>
+        <w:t>сформувати базу знань у вигляді продукційних правил для обраної предметної області</w:t>
+      </w:r>
+      <w:r>
+        <w:rPr>
+          <w:lang w:val="uk-UA"/>
+        </w:rPr>
+        <w:t>,</w:t>
+      </w:r>
+      <w:r>
+        <w:rPr>
+          <w:lang w:val="uk-UA"/>
+        </w:rPr>
+        <w:t>розробити алгоритм прямого логічного виведення</w:t>
+      </w:r>
+      <w:r>
+        <w:rPr>
+          <w:lang w:val="uk-UA"/>
+        </w:rPr>
+        <w:t>,</w:t>
+      </w:r>
+      <w:r>
+        <w:rPr>
+          <w:lang w:val="uk-UA"/>
+        </w:rPr>
+        <w:t xml:space="preserve"> </w:t>
+      </w:r>
+      <w:r>
+        <w:rPr>
+          <w:lang w:val="uk-UA"/>
+        </w:rPr>
+        <w:t>реалізувати механізм виведення мовою Python із використанням робочої пам’яті та черги фактів</w:t>
+      </w:r>
+      <w:r>
+        <w:rPr>
+          <w:lang w:val="uk-UA"/>
+        </w:rPr>
+        <w:t>,</w:t>
+      </w:r>
+      <w:r>
+        <w:rPr>
+          <w:lang w:val="uk-UA"/>
+        </w:rPr>
+        <w:t xml:space="preserve"> </w:t>
+      </w:r>
+      <w:r>
+        <w:rPr>
+          <w:lang w:val="uk-UA"/>
+        </w:rPr>
+        <w:t>забезпечити формування діагностичних висновків і відображення ланцюга спрацювання правил</w:t>
+      </w:r>
+      <w:r>
+        <w:rPr>
+          <w:lang w:val="uk-UA"/>
+        </w:rPr>
+        <w:t>,</w:t>
+      </w:r>
+      <w:r>
+        <w:rPr>
+          <w:lang w:val="uk-UA"/>
+        </w:rPr>
+        <w:t xml:space="preserve"> </w:t>
+      </w:r>
+      <w:r>
+        <w:rPr>
+          <w:lang w:val="uk-UA"/>
+        </w:rPr>
+        <w:t>перевірити коректність роботи системи на тестових наборах вихідних фактів та проаналізувати отримані результати.</w:t>
+      </w:r>
+    </w:p>
+    <w:p>
+      <w:pPr>
+        <w:pStyle w:val="a7"/>
         <w:spacing w:after="0"/>
       </w:pPr>
       <w:bookmarkStart w:id="1" w:name="_Toc242178468"/>
@@ -1220,10 +1444,7 @@
         <w:t xml:space="preserve">та </w:t>
       </w:r>
       <w:r>
-        <w:t>П</w:t>
-      </w:r>
-      <w:r>
-        <w:t>остановка завдання</w:t>
+        <w:t>Постановка завдання</w:t>
       </w:r>
       <w:r>
         <w:rPr>
@@ -1372,7 +1593,7 @@
     </w:p>
     <w:p>
       <w:pPr>
-        <w:pStyle w:val="a0"/>
+        <w:pStyle w:val="a1"/>
         <w:spacing w:before="0" w:after="0"/>
         <w:rPr>
           <w:rFonts w:eastAsiaTheme="minorEastAsia"/>
@@ -1383,7 +1604,7 @@
     </w:p>
     <w:p>
       <w:pPr>
-        <w:pStyle w:val="a0"/>
+        <w:pStyle w:val="a1"/>
         <w:spacing w:before="0" w:after="0"/>
       </w:pPr>
       <w:r>
@@ -1438,121 +1659,121 @@
     </w:p>
     <w:p>
       <w:pPr>
+        <w:pStyle w:val="a2"/>
+        <w:spacing w:after="0"/>
+      </w:pPr>
+      <w:r>
+        <w:t xml:space="preserve">Рисунок </w:t>
+      </w:r>
+      <w:r>
+        <w:rPr>
+          <w:noProof/>
+        </w:rPr>
+        <w:fldChar w:fldCharType="begin"/>
+      </w:r>
+      <w:r>
+        <w:rPr>
+          <w:noProof/>
+        </w:rPr>
+        <w:instrText xml:space="preserve"> STYLEREF 1 \s </w:instrText>
+      </w:r>
+      <w:r>
+        <w:rPr>
+          <w:noProof/>
+        </w:rPr>
+        <w:fldChar w:fldCharType="separate"/>
+      </w:r>
+      <w:r>
+        <w:rPr>
+          <w:noProof/>
+        </w:rPr>
+        <w:t>1</w:t>
+      </w:r>
+      <w:r>
+        <w:rPr>
+          <w:noProof/>
+        </w:rPr>
+        <w:fldChar w:fldCharType="end"/>
+      </w:r>
+      <w:r>
+        <w:t>.</w:t>
+      </w:r>
+      <w:r>
+        <w:fldChar w:fldCharType="begin"/>
+      </w:r>
+      <w:r>
+        <w:instrText xml:space="preserve"> SEQ Рисунок \* ARABIC </w:instrText>
+      </w:r>
+      <w:r>
+        <w:fldChar w:fldCharType="separate"/>
+      </w:r>
+      <w:r>
+        <w:rPr>
+          <w:noProof/>
+        </w:rPr>
+        <w:t>1</w:t>
+      </w:r>
+      <w:r>
+        <w:fldChar w:fldCharType="end"/>
+      </w:r>
+      <w:r>
+        <w:t xml:space="preserve"> –</w:t>
+      </w:r>
+      <w:r>
+        <w:t xml:space="preserve"> </w:t>
+      </w:r>
+      <w:r>
+        <w:t>Використання гі</w:t>
+      </w:r>
+      <w:r>
+        <w:t>т</w:t>
+      </w:r>
+      <w:r>
+        <w:t>а</w:t>
+      </w:r>
+    </w:p>
+    <w:p>
+      <w:pPr>
+        <w:rPr>
+          <w:lang w:val="uk-UA"/>
+        </w:rPr>
+      </w:pPr>
+    </w:p>
+    <w:p>
+      <w:pPr>
+        <w:rPr>
+          <w:lang w:val="uk-UA"/>
+        </w:rPr>
+      </w:pPr>
+      <w:r>
+        <w:rPr>
+          <w:lang w:val="uk-UA"/>
+        </w:rPr>
+        <w:t>На рис. 1.</w:t>
+      </w:r>
+      <w:r>
+        <w:rPr>
+          <w:lang w:val="uk-UA"/>
+        </w:rPr>
+        <w:t>2</w:t>
+      </w:r>
+      <w:r>
+        <w:rPr>
+          <w:lang w:val="uk-UA"/>
+        </w:rPr>
+        <w:t xml:space="preserve"> узагальнена структура експертної системи.</w:t>
+      </w:r>
+    </w:p>
+    <w:p>
+      <w:pPr>
+        <w:rPr>
+          <w:lang w:val="uk-UA"/>
+        </w:rPr>
+      </w:pPr>
+    </w:p>
+    <w:p>
+      <w:pPr>
         <w:pStyle w:val="a1"/>
-        <w:spacing w:after="0"/>
-      </w:pPr>
-      <w:r>
-        <w:t xml:space="preserve">Рисунок </w:t>
-      </w:r>
-      <w:r>
-        <w:rPr>
-          <w:noProof/>
-        </w:rPr>
-        <w:fldChar w:fldCharType="begin"/>
-      </w:r>
-      <w:r>
-        <w:rPr>
-          <w:noProof/>
-        </w:rPr>
-        <w:instrText xml:space="preserve"> STYLEREF 1 \s </w:instrText>
-      </w:r>
-      <w:r>
-        <w:rPr>
-          <w:noProof/>
-        </w:rPr>
-        <w:fldChar w:fldCharType="separate"/>
-      </w:r>
-      <w:r>
-        <w:rPr>
-          <w:noProof/>
-        </w:rPr>
-        <w:t>1</w:t>
-      </w:r>
-      <w:r>
-        <w:rPr>
-          <w:noProof/>
-        </w:rPr>
-        <w:fldChar w:fldCharType="end"/>
-      </w:r>
-      <w:r>
-        <w:t>.</w:t>
-      </w:r>
-      <w:r>
-        <w:fldChar w:fldCharType="begin"/>
-      </w:r>
-      <w:r>
-        <w:instrText xml:space="preserve"> SEQ Рисунок \* ARABIC </w:instrText>
-      </w:r>
-      <w:r>
-        <w:fldChar w:fldCharType="separate"/>
-      </w:r>
-      <w:r>
-        <w:rPr>
-          <w:noProof/>
-        </w:rPr>
-        <w:t>1</w:t>
-      </w:r>
-      <w:r>
-        <w:fldChar w:fldCharType="end"/>
-      </w:r>
-      <w:r>
-        <w:t xml:space="preserve"> –</w:t>
-      </w:r>
-      <w:r>
-        <w:t xml:space="preserve"> </w:t>
-      </w:r>
-      <w:r>
-        <w:t>Використання гі</w:t>
-      </w:r>
-      <w:r>
-        <w:t>т</w:t>
-      </w:r>
-      <w:r>
-        <w:t>а</w:t>
-      </w:r>
-    </w:p>
-    <w:p>
-      <w:pPr>
-        <w:rPr>
-          <w:lang w:val="uk-UA"/>
-        </w:rPr>
-      </w:pPr>
-    </w:p>
-    <w:p>
-      <w:pPr>
-        <w:rPr>
-          <w:lang w:val="uk-UA"/>
-        </w:rPr>
-      </w:pPr>
-      <w:r>
-        <w:rPr>
-          <w:lang w:val="uk-UA"/>
-        </w:rPr>
-        <w:t>На рис. 1.</w:t>
-      </w:r>
-      <w:r>
-        <w:rPr>
-          <w:lang w:val="uk-UA"/>
-        </w:rPr>
-        <w:t>2</w:t>
-      </w:r>
-      <w:r>
-        <w:rPr>
-          <w:lang w:val="uk-UA"/>
-        </w:rPr>
-        <w:t xml:space="preserve"> узагальнена структура експертної системи.</w:t>
-      </w:r>
-    </w:p>
-    <w:p>
-      <w:pPr>
-        <w:rPr>
-          <w:lang w:val="uk-UA"/>
-        </w:rPr>
-      </w:pPr>
-    </w:p>
-    <w:p>
-      <w:pPr>
-        <w:pStyle w:val="a0"/>
         <w:spacing w:before="0" w:after="0"/>
       </w:pPr>
       <w:r>
@@ -1598,83 +1819,83 @@
     </w:p>
     <w:p>
       <w:pPr>
+        <w:pStyle w:val="a2"/>
+        <w:spacing w:after="0"/>
+        <w:rPr>
+          <w:rFonts w:eastAsiaTheme="minorEastAsia"/>
+          <w:lang w:eastAsia="ja-JP"/>
+        </w:rPr>
+      </w:pPr>
+      <w:r>
+        <w:t xml:space="preserve">Рисунок </w:t>
+      </w:r>
+      <w:r>
+        <w:rPr>
+          <w:noProof/>
+        </w:rPr>
+        <w:fldChar w:fldCharType="begin"/>
+      </w:r>
+      <w:r>
+        <w:rPr>
+          <w:noProof/>
+        </w:rPr>
+        <w:instrText xml:space="preserve"> STYLEREF 1 \s </w:instrText>
+      </w:r>
+      <w:r>
+        <w:rPr>
+          <w:noProof/>
+        </w:rPr>
+        <w:fldChar w:fldCharType="separate"/>
+      </w:r>
+      <w:r>
+        <w:rPr>
+          <w:noProof/>
+        </w:rPr>
+        <w:t>1</w:t>
+      </w:r>
+      <w:r>
+        <w:rPr>
+          <w:noProof/>
+        </w:rPr>
+        <w:fldChar w:fldCharType="end"/>
+      </w:r>
+      <w:r>
+        <w:t>.</w:t>
+      </w:r>
+      <w:r>
+        <w:fldChar w:fldCharType="begin"/>
+      </w:r>
+      <w:r>
+        <w:instrText xml:space="preserve"> SEQ Рисунок \* ARABIC </w:instrText>
+      </w:r>
+      <w:r>
+        <w:fldChar w:fldCharType="separate"/>
+      </w:r>
+      <w:r>
+        <w:rPr>
+          <w:noProof/>
+        </w:rPr>
+        <w:t>2</w:t>
+      </w:r>
+      <w:r>
+        <w:fldChar w:fldCharType="end"/>
+      </w:r>
+      <w:r>
+        <w:t xml:space="preserve"> –</w:t>
+      </w:r>
+      <w:r>
+        <w:t xml:space="preserve"> </w:t>
+      </w:r>
+      <w:r>
+        <w:rPr>
+          <w:lang w:eastAsia="ja-JP"/>
+        </w:rPr>
+        <w:t>Узагальнена структура експертної системи</w:t>
+      </w:r>
+    </w:p>
+    <w:p>
+      <w:pPr>
         <w:pStyle w:val="a1"/>
-        <w:spacing w:after="0"/>
-        <w:rPr>
-          <w:rFonts w:eastAsiaTheme="minorEastAsia" w:hint="eastAsia"/>
-          <w:lang w:eastAsia="ja-JP"/>
-        </w:rPr>
-      </w:pPr>
-      <w:r>
-        <w:t xml:space="preserve">Рисунок </w:t>
-      </w:r>
-      <w:r>
-        <w:rPr>
-          <w:noProof/>
-        </w:rPr>
-        <w:fldChar w:fldCharType="begin"/>
-      </w:r>
-      <w:r>
-        <w:rPr>
-          <w:noProof/>
-        </w:rPr>
-        <w:instrText xml:space="preserve"> STYLEREF 1 \s </w:instrText>
-      </w:r>
-      <w:r>
-        <w:rPr>
-          <w:noProof/>
-        </w:rPr>
-        <w:fldChar w:fldCharType="separate"/>
-      </w:r>
-      <w:r>
-        <w:rPr>
-          <w:noProof/>
-        </w:rPr>
-        <w:t>1</w:t>
-      </w:r>
-      <w:r>
-        <w:rPr>
-          <w:noProof/>
-        </w:rPr>
-        <w:fldChar w:fldCharType="end"/>
-      </w:r>
-      <w:r>
-        <w:t>.</w:t>
-      </w:r>
-      <w:r>
-        <w:fldChar w:fldCharType="begin"/>
-      </w:r>
-      <w:r>
-        <w:instrText xml:space="preserve"> SEQ Рисунок \* ARABIC </w:instrText>
-      </w:r>
-      <w:r>
-        <w:fldChar w:fldCharType="separate"/>
-      </w:r>
-      <w:r>
-        <w:rPr>
-          <w:noProof/>
-        </w:rPr>
-        <w:t>2</w:t>
-      </w:r>
-      <w:r>
-        <w:fldChar w:fldCharType="end"/>
-      </w:r>
-      <w:r>
-        <w:t xml:space="preserve"> –</w:t>
-      </w:r>
-      <w:r>
-        <w:t xml:space="preserve"> </w:t>
-      </w:r>
-      <w:r>
-        <w:rPr>
-          <w:lang w:eastAsia="ja-JP"/>
-        </w:rPr>
-        <w:t>Узагальнена структура експертної системи</w:t>
-      </w:r>
-    </w:p>
-    <w:p>
-      <w:pPr>
-        <w:pStyle w:val="a0"/>
         <w:spacing w:before="0" w:after="0"/>
       </w:pPr>
       <w:r>
@@ -1731,10 +1952,10 @@
     </w:p>
     <w:p>
       <w:pPr>
-        <w:pStyle w:val="a1"/>
+        <w:pStyle w:val="a2"/>
         <w:spacing w:after="0"/>
         <w:rPr>
-          <w:rFonts w:eastAsiaTheme="minorEastAsia" w:hint="eastAsia"/>
+          <w:rFonts w:eastAsiaTheme="minorEastAsia"/>
           <w:lang w:eastAsia="ja-JP"/>
         </w:rPr>
       </w:pPr>
@@ -2879,7 +3100,7 @@
     </w:p>
     <w:p>
       <w:pPr>
-        <w:pStyle w:val="a"/>
+        <w:pStyle w:val="a0"/>
         <w:rPr>
           <w:rFonts w:eastAsiaTheme="minorEastAsia"/>
           <w:lang w:eastAsia="ja-JP"/>
@@ -2888,7 +3109,7 @@
     </w:p>
     <w:p>
       <w:pPr>
-        <w:pStyle w:val="a"/>
+        <w:pStyle w:val="a0"/>
         <w:rPr>
           <w:rFonts w:eastAsiaTheme="minorEastAsia"/>
           <w:lang w:val="uk-UA" w:eastAsia="ja-JP"/>
@@ -2904,7 +3125,7 @@
     </w:p>
     <w:p>
       <w:pPr>
-        <w:pStyle w:val="a"/>
+        <w:pStyle w:val="a0"/>
         <w:rPr>
           <w:rFonts w:eastAsiaTheme="minorEastAsia"/>
           <w:lang w:val="uk-UA" w:eastAsia="ja-JP"/>
@@ -2920,16 +3141,16 @@
     </w:p>
     <w:p>
       <w:pPr>
-        <w:pStyle w:val="a"/>
-        <w:rPr>
-          <w:rFonts w:eastAsiaTheme="minorEastAsia"/>
-          <w:lang w:val="uk-UA" w:eastAsia="ja-JP"/>
-        </w:rPr>
-      </w:pPr>
-    </w:p>
-    <w:p>
-      <w:pPr>
-        <w:pStyle w:val="a"/>
+        <w:pStyle w:val="a0"/>
+        <w:rPr>
+          <w:rFonts w:eastAsiaTheme="minorEastAsia"/>
+          <w:lang w:val="uk-UA" w:eastAsia="ja-JP"/>
+        </w:rPr>
+      </w:pPr>
+    </w:p>
+    <w:p>
+      <w:pPr>
+        <w:pStyle w:val="a0"/>
         <w:rPr>
           <w:rFonts w:eastAsiaTheme="minorEastAsia"/>
           <w:lang w:val="uk-UA" w:eastAsia="ja-JP"/>
@@ -2945,7 +3166,7 @@
     </w:p>
     <w:p>
       <w:pPr>
-        <w:pStyle w:val="a"/>
+        <w:pStyle w:val="a0"/>
         <w:rPr>
           <w:rFonts w:eastAsiaTheme="minorEastAsia"/>
           <w:lang w:val="uk-UA" w:eastAsia="ja-JP"/>
@@ -2961,7 +3182,7 @@
     </w:p>
     <w:p>
       <w:pPr>
-        <w:pStyle w:val="a"/>
+        <w:pStyle w:val="a0"/>
         <w:rPr>
           <w:rFonts w:eastAsiaTheme="minorEastAsia"/>
           <w:lang w:val="uk-UA" w:eastAsia="ja-JP"/>
@@ -2977,7 +3198,7 @@
     </w:p>
     <w:p>
       <w:pPr>
-        <w:pStyle w:val="a"/>
+        <w:pStyle w:val="a0"/>
         <w:rPr>
           <w:rFonts w:eastAsiaTheme="minorEastAsia"/>
           <w:lang w:val="uk-UA" w:eastAsia="ja-JP"/>
@@ -2993,7 +3214,7 @@
     </w:p>
     <w:p>
       <w:pPr>
-        <w:pStyle w:val="a"/>
+        <w:pStyle w:val="a0"/>
         <w:rPr>
           <w:rFonts w:eastAsiaTheme="minorEastAsia"/>
           <w:lang w:val="uk-UA" w:eastAsia="ja-JP"/>
@@ -3009,7 +3230,7 @@
     </w:p>
     <w:p>
       <w:pPr>
-        <w:pStyle w:val="a"/>
+        <w:pStyle w:val="a0"/>
         <w:rPr>
           <w:rFonts w:eastAsiaTheme="minorEastAsia"/>
           <w:lang w:val="uk-UA" w:eastAsia="ja-JP"/>
@@ -3025,16 +3246,16 @@
     </w:p>
     <w:p>
       <w:pPr>
-        <w:pStyle w:val="a"/>
-        <w:rPr>
-          <w:rFonts w:eastAsiaTheme="minorEastAsia"/>
-          <w:lang w:val="uk-UA" w:eastAsia="ja-JP"/>
-        </w:rPr>
-      </w:pPr>
-    </w:p>
-    <w:p>
-      <w:pPr>
-        <w:pStyle w:val="a"/>
+        <w:pStyle w:val="a0"/>
+        <w:rPr>
+          <w:rFonts w:eastAsiaTheme="minorEastAsia"/>
+          <w:lang w:val="uk-UA" w:eastAsia="ja-JP"/>
+        </w:rPr>
+      </w:pPr>
+    </w:p>
+    <w:p>
+      <w:pPr>
+        <w:pStyle w:val="a0"/>
         <w:rPr>
           <w:rFonts w:eastAsiaTheme="minorEastAsia"/>
           <w:lang w:val="uk-UA" w:eastAsia="ja-JP"/>
@@ -3050,7 +3271,7 @@
     </w:p>
     <w:p>
       <w:pPr>
-        <w:pStyle w:val="a"/>
+        <w:pStyle w:val="a0"/>
         <w:rPr>
           <w:rFonts w:eastAsiaTheme="minorEastAsia"/>
           <w:lang w:val="uk-UA" w:eastAsia="ja-JP"/>
@@ -3066,7 +3287,7 @@
     </w:p>
     <w:p>
       <w:pPr>
-        <w:pStyle w:val="a"/>
+        <w:pStyle w:val="a0"/>
         <w:rPr>
           <w:rFonts w:eastAsiaTheme="minorEastAsia"/>
           <w:lang w:val="uk-UA" w:eastAsia="ja-JP"/>
@@ -3082,7 +3303,7 @@
     </w:p>
     <w:p>
       <w:pPr>
-        <w:pStyle w:val="a"/>
+        <w:pStyle w:val="a0"/>
         <w:rPr>
           <w:rFonts w:eastAsiaTheme="minorEastAsia"/>
           <w:lang w:val="uk-UA" w:eastAsia="ja-JP"/>
@@ -3098,7 +3319,7 @@
     </w:p>
     <w:p>
       <w:pPr>
-        <w:pStyle w:val="a"/>
+        <w:pStyle w:val="a0"/>
         <w:rPr>
           <w:rFonts w:eastAsiaTheme="minorEastAsia"/>
           <w:lang w:val="uk-UA" w:eastAsia="ja-JP"/>
@@ -3114,7 +3335,7 @@
     </w:p>
     <w:p>
       <w:pPr>
-        <w:pStyle w:val="a"/>
+        <w:pStyle w:val="a0"/>
         <w:rPr>
           <w:rFonts w:eastAsiaTheme="minorEastAsia"/>
           <w:lang w:val="uk-UA" w:eastAsia="ja-JP"/>
@@ -3130,16 +3351,16 @@
     </w:p>
     <w:p>
       <w:pPr>
-        <w:pStyle w:val="a"/>
-        <w:rPr>
-          <w:rFonts w:eastAsiaTheme="minorEastAsia"/>
-          <w:lang w:val="uk-UA" w:eastAsia="ja-JP"/>
-        </w:rPr>
-      </w:pPr>
-    </w:p>
-    <w:p>
-      <w:pPr>
-        <w:pStyle w:val="a"/>
+        <w:pStyle w:val="a0"/>
+        <w:rPr>
+          <w:rFonts w:eastAsiaTheme="minorEastAsia"/>
+          <w:lang w:val="uk-UA" w:eastAsia="ja-JP"/>
+        </w:rPr>
+      </w:pPr>
+    </w:p>
+    <w:p>
+      <w:pPr>
+        <w:pStyle w:val="a0"/>
         <w:rPr>
           <w:rFonts w:eastAsiaTheme="minorEastAsia"/>
           <w:lang w:val="uk-UA" w:eastAsia="ja-JP"/>
@@ -3155,7 +3376,7 @@
     </w:p>
     <w:p>
       <w:pPr>
-        <w:pStyle w:val="a"/>
+        <w:pStyle w:val="a0"/>
         <w:rPr>
           <w:rFonts w:eastAsiaTheme="minorEastAsia"/>
           <w:lang w:val="uk-UA" w:eastAsia="ja-JP"/>
@@ -3171,7 +3392,7 @@
     </w:p>
     <w:p>
       <w:pPr>
-        <w:pStyle w:val="a"/>
+        <w:pStyle w:val="a0"/>
         <w:rPr>
           <w:rFonts w:eastAsiaTheme="minorEastAsia"/>
           <w:lang w:val="uk-UA" w:eastAsia="ja-JP"/>
@@ -3187,7 +3408,7 @@
     </w:p>
     <w:p>
       <w:pPr>
-        <w:pStyle w:val="a"/>
+        <w:pStyle w:val="a0"/>
         <w:rPr>
           <w:rFonts w:eastAsiaTheme="minorEastAsia"/>
           <w:lang w:val="uk-UA" w:eastAsia="ja-JP"/>
@@ -3203,7 +3424,7 @@
     </w:p>
     <w:p>
       <w:pPr>
-        <w:pStyle w:val="a"/>
+        <w:pStyle w:val="a0"/>
         <w:rPr>
           <w:rFonts w:eastAsiaTheme="minorEastAsia"/>
           <w:lang w:val="uk-UA" w:eastAsia="ja-JP"/>
@@ -3219,16 +3440,16 @@
     </w:p>
     <w:p>
       <w:pPr>
-        <w:pStyle w:val="a"/>
-        <w:rPr>
-          <w:rFonts w:eastAsiaTheme="minorEastAsia"/>
-          <w:lang w:val="uk-UA" w:eastAsia="ja-JP"/>
-        </w:rPr>
-      </w:pPr>
-    </w:p>
-    <w:p>
-      <w:pPr>
-        <w:pStyle w:val="a"/>
+        <w:pStyle w:val="a0"/>
+        <w:rPr>
+          <w:rFonts w:eastAsiaTheme="minorEastAsia"/>
+          <w:lang w:val="uk-UA" w:eastAsia="ja-JP"/>
+        </w:rPr>
+      </w:pPr>
+    </w:p>
+    <w:p>
+      <w:pPr>
+        <w:pStyle w:val="a0"/>
         <w:rPr>
           <w:rFonts w:eastAsiaTheme="minorEastAsia"/>
           <w:lang w:val="uk-UA" w:eastAsia="ja-JP"/>
@@ -3244,7 +3465,7 @@
     </w:p>
     <w:p>
       <w:pPr>
-        <w:pStyle w:val="a"/>
+        <w:pStyle w:val="a0"/>
         <w:rPr>
           <w:rFonts w:eastAsiaTheme="minorEastAsia"/>
           <w:lang w:val="uk-UA" w:eastAsia="ja-JP"/>
@@ -3260,7 +3481,7 @@
     </w:p>
     <w:p>
       <w:pPr>
-        <w:pStyle w:val="a"/>
+        <w:pStyle w:val="a0"/>
         <w:rPr>
           <w:rFonts w:eastAsiaTheme="minorEastAsia"/>
           <w:lang w:val="uk-UA" w:eastAsia="ja-JP"/>
@@ -3276,7 +3497,7 @@
     </w:p>
     <w:p>
       <w:pPr>
-        <w:pStyle w:val="a"/>
+        <w:pStyle w:val="a0"/>
         <w:rPr>
           <w:rFonts w:eastAsiaTheme="minorEastAsia"/>
           <w:lang w:val="uk-UA" w:eastAsia="ja-JP"/>
@@ -3292,7 +3513,7 @@
     </w:p>
     <w:p>
       <w:pPr>
-        <w:pStyle w:val="a"/>
+        <w:pStyle w:val="a0"/>
         <w:rPr>
           <w:rFonts w:eastAsiaTheme="minorEastAsia"/>
           <w:lang w:val="uk-UA" w:eastAsia="ja-JP"/>
@@ -3308,16 +3529,16 @@
     </w:p>
     <w:p>
       <w:pPr>
-        <w:pStyle w:val="a"/>
-        <w:rPr>
-          <w:rFonts w:eastAsiaTheme="minorEastAsia"/>
-          <w:lang w:val="uk-UA" w:eastAsia="ja-JP"/>
-        </w:rPr>
-      </w:pPr>
-    </w:p>
-    <w:p>
-      <w:pPr>
-        <w:pStyle w:val="a"/>
+        <w:pStyle w:val="a0"/>
+        <w:rPr>
+          <w:rFonts w:eastAsiaTheme="minorEastAsia"/>
+          <w:lang w:val="uk-UA" w:eastAsia="ja-JP"/>
+        </w:rPr>
+      </w:pPr>
+    </w:p>
+    <w:p>
+      <w:pPr>
+        <w:pStyle w:val="a0"/>
         <w:rPr>
           <w:rFonts w:eastAsiaTheme="minorEastAsia"/>
           <w:lang w:val="uk-UA" w:eastAsia="ja-JP"/>
@@ -3333,7 +3554,7 @@
     </w:p>
     <w:p>
       <w:pPr>
-        <w:pStyle w:val="a"/>
+        <w:pStyle w:val="a0"/>
         <w:rPr>
           <w:rFonts w:eastAsiaTheme="minorEastAsia"/>
           <w:lang w:val="uk-UA" w:eastAsia="ja-JP"/>
@@ -3349,7 +3570,7 @@
     </w:p>
     <w:p>
       <w:pPr>
-        <w:pStyle w:val="a"/>
+        <w:pStyle w:val="a0"/>
         <w:rPr>
           <w:rFonts w:eastAsiaTheme="minorEastAsia"/>
           <w:lang w:val="uk-UA" w:eastAsia="ja-JP"/>
@@ -3365,7 +3586,7 @@
     </w:p>
     <w:p>
       <w:pPr>
-        <w:pStyle w:val="a"/>
+        <w:pStyle w:val="a0"/>
         <w:rPr>
           <w:rFonts w:eastAsiaTheme="minorEastAsia"/>
           <w:lang w:val="uk-UA" w:eastAsia="ja-JP"/>
@@ -3381,7 +3602,7 @@
     </w:p>
     <w:p>
       <w:pPr>
-        <w:pStyle w:val="a"/>
+        <w:pStyle w:val="a0"/>
         <w:rPr>
           <w:rFonts w:eastAsiaTheme="minorEastAsia"/>
           <w:lang w:val="uk-UA" w:eastAsia="ja-JP"/>
@@ -3397,16 +3618,16 @@
     </w:p>
     <w:p>
       <w:pPr>
-        <w:pStyle w:val="a"/>
-        <w:rPr>
-          <w:rFonts w:eastAsiaTheme="minorEastAsia"/>
-          <w:lang w:val="uk-UA" w:eastAsia="ja-JP"/>
-        </w:rPr>
-      </w:pPr>
-    </w:p>
-    <w:p>
-      <w:pPr>
-        <w:pStyle w:val="a"/>
+        <w:pStyle w:val="a0"/>
+        <w:rPr>
+          <w:rFonts w:eastAsiaTheme="minorEastAsia"/>
+          <w:lang w:val="uk-UA" w:eastAsia="ja-JP"/>
+        </w:rPr>
+      </w:pPr>
+    </w:p>
+    <w:p>
+      <w:pPr>
+        <w:pStyle w:val="a0"/>
         <w:rPr>
           <w:rFonts w:eastAsiaTheme="minorEastAsia"/>
           <w:lang w:val="uk-UA" w:eastAsia="ja-JP"/>
@@ -3422,7 +3643,7 @@
     </w:p>
     <w:p>
       <w:pPr>
-        <w:pStyle w:val="a"/>
+        <w:pStyle w:val="a0"/>
         <w:rPr>
           <w:rFonts w:eastAsiaTheme="minorEastAsia"/>
           <w:lang w:val="uk-UA" w:eastAsia="ja-JP"/>
@@ -3438,7 +3659,7 @@
     </w:p>
     <w:p>
       <w:pPr>
-        <w:pStyle w:val="a"/>
+        <w:pStyle w:val="a0"/>
         <w:rPr>
           <w:rFonts w:eastAsiaTheme="minorEastAsia"/>
           <w:lang w:val="uk-UA" w:eastAsia="ja-JP"/>
@@ -3454,7 +3675,7 @@
     </w:p>
     <w:p>
       <w:pPr>
-        <w:pStyle w:val="a"/>
+        <w:pStyle w:val="a0"/>
         <w:rPr>
           <w:rFonts w:eastAsiaTheme="minorEastAsia"/>
           <w:lang w:val="uk-UA" w:eastAsia="ja-JP"/>
@@ -3470,7 +3691,7 @@
     </w:p>
     <w:p>
       <w:pPr>
-        <w:pStyle w:val="a"/>
+        <w:pStyle w:val="a0"/>
         <w:rPr>
           <w:rFonts w:eastAsiaTheme="minorEastAsia"/>
           <w:lang w:val="uk-UA" w:eastAsia="ja-JP"/>
@@ -3486,16 +3707,16 @@
     </w:p>
     <w:p>
       <w:pPr>
-        <w:pStyle w:val="a"/>
-        <w:rPr>
-          <w:rFonts w:eastAsiaTheme="minorEastAsia"/>
-          <w:lang w:val="uk-UA" w:eastAsia="ja-JP"/>
-        </w:rPr>
-      </w:pPr>
-    </w:p>
-    <w:p>
-      <w:pPr>
-        <w:pStyle w:val="a"/>
+        <w:pStyle w:val="a0"/>
+        <w:rPr>
+          <w:rFonts w:eastAsiaTheme="minorEastAsia"/>
+          <w:lang w:val="uk-UA" w:eastAsia="ja-JP"/>
+        </w:rPr>
+      </w:pPr>
+    </w:p>
+    <w:p>
+      <w:pPr>
+        <w:pStyle w:val="a0"/>
         <w:rPr>
           <w:rFonts w:eastAsiaTheme="minorEastAsia"/>
           <w:lang w:val="uk-UA" w:eastAsia="ja-JP"/>
@@ -3511,7 +3732,7 @@
     </w:p>
     <w:p>
       <w:pPr>
-        <w:pStyle w:val="a"/>
+        <w:pStyle w:val="a0"/>
         <w:rPr>
           <w:rFonts w:eastAsiaTheme="minorEastAsia"/>
           <w:lang w:val="uk-UA" w:eastAsia="ja-JP"/>
@@ -3527,7 +3748,7 @@
     </w:p>
     <w:p>
       <w:pPr>
-        <w:pStyle w:val="a"/>
+        <w:pStyle w:val="a0"/>
         <w:rPr>
           <w:rFonts w:eastAsiaTheme="minorEastAsia"/>
           <w:lang w:val="uk-UA" w:eastAsia="ja-JP"/>
@@ -3543,7 +3764,7 @@
     </w:p>
     <w:p>
       <w:pPr>
-        <w:pStyle w:val="a"/>
+        <w:pStyle w:val="a0"/>
         <w:rPr>
           <w:rFonts w:eastAsiaTheme="minorEastAsia"/>
           <w:lang w:val="uk-UA" w:eastAsia="ja-JP"/>
@@ -3559,7 +3780,7 @@
     </w:p>
     <w:p>
       <w:pPr>
-        <w:pStyle w:val="a"/>
+        <w:pStyle w:val="a0"/>
         <w:rPr>
           <w:rFonts w:eastAsiaTheme="minorEastAsia"/>
           <w:lang w:val="uk-UA" w:eastAsia="ja-JP"/>
@@ -3575,16 +3796,16 @@
     </w:p>
     <w:p>
       <w:pPr>
-        <w:pStyle w:val="a"/>
-        <w:rPr>
-          <w:rFonts w:eastAsiaTheme="minorEastAsia"/>
-          <w:lang w:val="uk-UA" w:eastAsia="ja-JP"/>
-        </w:rPr>
-      </w:pPr>
-    </w:p>
-    <w:p>
-      <w:pPr>
-        <w:pStyle w:val="a"/>
+        <w:pStyle w:val="a0"/>
+        <w:rPr>
+          <w:rFonts w:eastAsiaTheme="minorEastAsia"/>
+          <w:lang w:val="uk-UA" w:eastAsia="ja-JP"/>
+        </w:rPr>
+      </w:pPr>
+    </w:p>
+    <w:p>
+      <w:pPr>
+        <w:pStyle w:val="a0"/>
         <w:rPr>
           <w:rFonts w:eastAsiaTheme="minorEastAsia"/>
           <w:lang w:val="uk-UA" w:eastAsia="ja-JP"/>
@@ -3600,7 +3821,7 @@
     </w:p>
     <w:p>
       <w:pPr>
-        <w:pStyle w:val="a"/>
+        <w:pStyle w:val="a0"/>
         <w:rPr>
           <w:rFonts w:eastAsiaTheme="minorEastAsia"/>
           <w:lang w:val="uk-UA" w:eastAsia="ja-JP"/>
@@ -3616,7 +3837,7 @@
     </w:p>
     <w:p>
       <w:pPr>
-        <w:pStyle w:val="a"/>
+        <w:pStyle w:val="a0"/>
         <w:rPr>
           <w:rFonts w:eastAsiaTheme="minorEastAsia"/>
           <w:lang w:val="uk-UA" w:eastAsia="ja-JP"/>
@@ -3632,7 +3853,7 @@
     </w:p>
     <w:p>
       <w:pPr>
-        <w:pStyle w:val="a"/>
+        <w:pStyle w:val="a0"/>
         <w:rPr>
           <w:rFonts w:eastAsiaTheme="minorEastAsia"/>
           <w:lang w:val="uk-UA" w:eastAsia="ja-JP"/>
@@ -3648,7 +3869,7 @@
     </w:p>
     <w:p>
       <w:pPr>
-        <w:pStyle w:val="a"/>
+        <w:pStyle w:val="a0"/>
         <w:rPr>
           <w:rFonts w:eastAsiaTheme="minorEastAsia"/>
           <w:lang w:val="uk-UA" w:eastAsia="ja-JP"/>
@@ -3664,16 +3885,16 @@
     </w:p>
     <w:p>
       <w:pPr>
-        <w:pStyle w:val="a"/>
-        <w:rPr>
-          <w:rFonts w:eastAsiaTheme="minorEastAsia"/>
-          <w:lang w:val="uk-UA" w:eastAsia="ja-JP"/>
-        </w:rPr>
-      </w:pPr>
-    </w:p>
-    <w:p>
-      <w:pPr>
-        <w:pStyle w:val="a"/>
+        <w:pStyle w:val="a0"/>
+        <w:rPr>
+          <w:rFonts w:eastAsiaTheme="minorEastAsia"/>
+          <w:lang w:val="uk-UA" w:eastAsia="ja-JP"/>
+        </w:rPr>
+      </w:pPr>
+    </w:p>
+    <w:p>
+      <w:pPr>
+        <w:pStyle w:val="a0"/>
         <w:rPr>
           <w:rFonts w:eastAsiaTheme="minorEastAsia"/>
           <w:lang w:val="uk-UA" w:eastAsia="ja-JP"/>
@@ -3689,7 +3910,7 @@
     </w:p>
     <w:p>
       <w:pPr>
-        <w:pStyle w:val="a"/>
+        <w:pStyle w:val="a0"/>
         <w:rPr>
           <w:rFonts w:eastAsiaTheme="minorEastAsia"/>
           <w:lang w:val="uk-UA" w:eastAsia="ja-JP"/>
@@ -3706,7 +3927,7 @@
     </w:p>
     <w:p>
       <w:pPr>
-        <w:pStyle w:val="a"/>
+        <w:pStyle w:val="a0"/>
         <w:rPr>
           <w:rFonts w:eastAsiaTheme="minorEastAsia"/>
           <w:lang w:val="uk-UA" w:eastAsia="ja-JP"/>
@@ -3722,7 +3943,7 @@
     </w:p>
     <w:p>
       <w:pPr>
-        <w:pStyle w:val="a"/>
+        <w:pStyle w:val="a0"/>
         <w:rPr>
           <w:rFonts w:eastAsiaTheme="minorEastAsia"/>
           <w:lang w:val="uk-UA" w:eastAsia="ja-JP"/>
@@ -3738,7 +3959,7 @@
     </w:p>
     <w:p>
       <w:pPr>
-        <w:pStyle w:val="a"/>
+        <w:pStyle w:val="a0"/>
         <w:rPr>
           <w:rFonts w:eastAsiaTheme="minorEastAsia"/>
           <w:lang w:val="uk-UA" w:eastAsia="ja-JP"/>
@@ -3754,16 +3975,16 @@
     </w:p>
     <w:p>
       <w:pPr>
-        <w:pStyle w:val="a"/>
-        <w:rPr>
-          <w:rFonts w:eastAsiaTheme="minorEastAsia"/>
-          <w:lang w:val="uk-UA" w:eastAsia="ja-JP"/>
-        </w:rPr>
-      </w:pPr>
-    </w:p>
-    <w:p>
-      <w:pPr>
-        <w:pStyle w:val="a"/>
+        <w:pStyle w:val="a0"/>
+        <w:rPr>
+          <w:rFonts w:eastAsiaTheme="minorEastAsia"/>
+          <w:lang w:val="uk-UA" w:eastAsia="ja-JP"/>
+        </w:rPr>
+      </w:pPr>
+    </w:p>
+    <w:p>
+      <w:pPr>
+        <w:pStyle w:val="a0"/>
         <w:rPr>
           <w:rFonts w:eastAsiaTheme="minorEastAsia"/>
           <w:lang w:val="uk-UA" w:eastAsia="ja-JP"/>
@@ -3779,7 +4000,7 @@
     </w:p>
     <w:p>
       <w:pPr>
-        <w:pStyle w:val="a"/>
+        <w:pStyle w:val="a0"/>
         <w:rPr>
           <w:rFonts w:eastAsiaTheme="minorEastAsia"/>
           <w:lang w:val="uk-UA" w:eastAsia="ja-JP"/>
@@ -3795,7 +4016,7 @@
     </w:p>
     <w:p>
       <w:pPr>
-        <w:pStyle w:val="a"/>
+        <w:pStyle w:val="a0"/>
         <w:rPr>
           <w:rFonts w:eastAsiaTheme="minorEastAsia"/>
           <w:lang w:val="uk-UA" w:eastAsia="ja-JP"/>
@@ -3811,7 +4032,7 @@
     </w:p>
     <w:p>
       <w:pPr>
-        <w:pStyle w:val="a"/>
+        <w:pStyle w:val="a0"/>
         <w:rPr>
           <w:rFonts w:eastAsiaTheme="minorEastAsia"/>
           <w:lang w:val="uk-UA" w:eastAsia="ja-JP"/>
@@ -3827,7 +4048,7 @@
     </w:p>
     <w:p>
       <w:pPr>
-        <w:pStyle w:val="a"/>
+        <w:pStyle w:val="a0"/>
         <w:rPr>
           <w:rFonts w:eastAsiaTheme="minorEastAsia"/>
           <w:lang w:val="uk-UA" w:eastAsia="ja-JP"/>
@@ -3843,7 +4064,7 @@
     </w:p>
     <w:p>
       <w:pPr>
-        <w:pStyle w:val="a"/>
+        <w:pStyle w:val="a0"/>
         <w:rPr>
           <w:rFonts w:eastAsiaTheme="minorEastAsia"/>
           <w:lang w:val="uk-UA" w:eastAsia="ja-JP"/>
@@ -3859,16 +4080,16 @@
     </w:p>
     <w:p>
       <w:pPr>
-        <w:pStyle w:val="a"/>
-        <w:rPr>
-          <w:rFonts w:eastAsiaTheme="minorEastAsia"/>
-          <w:lang w:val="uk-UA" w:eastAsia="ja-JP"/>
-        </w:rPr>
-      </w:pPr>
-    </w:p>
-    <w:p>
-      <w:pPr>
-        <w:pStyle w:val="a"/>
+        <w:pStyle w:val="a0"/>
+        <w:rPr>
+          <w:rFonts w:eastAsiaTheme="minorEastAsia"/>
+          <w:lang w:val="uk-UA" w:eastAsia="ja-JP"/>
+        </w:rPr>
+      </w:pPr>
+    </w:p>
+    <w:p>
+      <w:pPr>
+        <w:pStyle w:val="a0"/>
         <w:rPr>
           <w:rFonts w:eastAsiaTheme="minorEastAsia"/>
           <w:lang w:val="uk-UA" w:eastAsia="ja-JP"/>
@@ -3884,7 +4105,7 @@
     </w:p>
     <w:p>
       <w:pPr>
-        <w:pStyle w:val="a"/>
+        <w:pStyle w:val="a0"/>
         <w:rPr>
           <w:rFonts w:eastAsiaTheme="minorEastAsia"/>
           <w:lang w:val="uk-UA" w:eastAsia="ja-JP"/>
@@ -3900,16 +4121,16 @@
     </w:p>
     <w:p>
       <w:pPr>
-        <w:pStyle w:val="a"/>
-        <w:rPr>
-          <w:rFonts w:eastAsiaTheme="minorEastAsia"/>
-          <w:lang w:val="uk-UA" w:eastAsia="ja-JP"/>
-        </w:rPr>
-      </w:pPr>
-    </w:p>
-    <w:p>
-      <w:pPr>
-        <w:pStyle w:val="a"/>
+        <w:pStyle w:val="a0"/>
+        <w:rPr>
+          <w:rFonts w:eastAsiaTheme="minorEastAsia"/>
+          <w:lang w:val="uk-UA" w:eastAsia="ja-JP"/>
+        </w:rPr>
+      </w:pPr>
+    </w:p>
+    <w:p>
+      <w:pPr>
+        <w:pStyle w:val="a0"/>
         <w:rPr>
           <w:rFonts w:eastAsiaTheme="minorEastAsia"/>
           <w:lang w:val="uk-UA" w:eastAsia="ja-JP"/>
@@ -3925,7 +4146,7 @@
     </w:p>
     <w:p>
       <w:pPr>
-        <w:pStyle w:val="a"/>
+        <w:pStyle w:val="a0"/>
         <w:rPr>
           <w:rFonts w:eastAsiaTheme="minorEastAsia"/>
           <w:lang w:val="uk-UA" w:eastAsia="ja-JP"/>
@@ -3941,16 +4162,16 @@
     </w:p>
     <w:p>
       <w:pPr>
-        <w:pStyle w:val="a"/>
-        <w:rPr>
-          <w:rFonts w:eastAsiaTheme="minorEastAsia"/>
-          <w:lang w:val="uk-UA" w:eastAsia="ja-JP"/>
-        </w:rPr>
-      </w:pPr>
-    </w:p>
-    <w:p>
-      <w:pPr>
-        <w:pStyle w:val="a"/>
+        <w:pStyle w:val="a0"/>
+        <w:rPr>
+          <w:rFonts w:eastAsiaTheme="minorEastAsia"/>
+          <w:lang w:val="uk-UA" w:eastAsia="ja-JP"/>
+        </w:rPr>
+      </w:pPr>
+    </w:p>
+    <w:p>
+      <w:pPr>
+        <w:pStyle w:val="a0"/>
         <w:rPr>
           <w:rFonts w:eastAsiaTheme="minorEastAsia"/>
           <w:lang w:val="uk-UA" w:eastAsia="ja-JP"/>
@@ -3966,16 +4187,16 @@
     </w:p>
     <w:p>
       <w:pPr>
-        <w:pStyle w:val="a"/>
-        <w:rPr>
-          <w:rFonts w:eastAsiaTheme="minorEastAsia"/>
-          <w:lang w:val="uk-UA" w:eastAsia="ja-JP"/>
-        </w:rPr>
-      </w:pPr>
-    </w:p>
-    <w:p>
-      <w:pPr>
-        <w:pStyle w:val="a"/>
+        <w:pStyle w:val="a0"/>
+        <w:rPr>
+          <w:rFonts w:eastAsiaTheme="minorEastAsia"/>
+          <w:lang w:val="uk-UA" w:eastAsia="ja-JP"/>
+        </w:rPr>
+      </w:pPr>
+    </w:p>
+    <w:p>
+      <w:pPr>
+        <w:pStyle w:val="a0"/>
         <w:rPr>
           <w:rFonts w:eastAsiaTheme="minorEastAsia"/>
           <w:lang w:val="uk-UA" w:eastAsia="ja-JP"/>
@@ -3991,7 +4212,7 @@
     </w:p>
     <w:p>
       <w:pPr>
-        <w:pStyle w:val="a"/>
+        <w:pStyle w:val="a0"/>
         <w:rPr>
           <w:rFonts w:eastAsiaTheme="minorEastAsia"/>
           <w:lang w:val="uk-UA" w:eastAsia="ja-JP"/>
@@ -4007,7 +4228,7 @@
     </w:p>
     <w:p>
       <w:pPr>
-        <w:pStyle w:val="a"/>
+        <w:pStyle w:val="a0"/>
         <w:rPr>
           <w:rFonts w:eastAsiaTheme="minorEastAsia"/>
           <w:lang w:val="uk-UA" w:eastAsia="ja-JP"/>
@@ -4023,16 +4244,16 @@
     </w:p>
     <w:p>
       <w:pPr>
-        <w:pStyle w:val="a"/>
-        <w:rPr>
-          <w:rFonts w:eastAsiaTheme="minorEastAsia"/>
-          <w:lang w:val="uk-UA" w:eastAsia="ja-JP"/>
-        </w:rPr>
-      </w:pPr>
-    </w:p>
-    <w:p>
-      <w:pPr>
-        <w:pStyle w:val="a"/>
+        <w:pStyle w:val="a0"/>
+        <w:rPr>
+          <w:rFonts w:eastAsiaTheme="minorEastAsia"/>
+          <w:lang w:val="uk-UA" w:eastAsia="ja-JP"/>
+        </w:rPr>
+      </w:pPr>
+    </w:p>
+    <w:p>
+      <w:pPr>
+        <w:pStyle w:val="a0"/>
         <w:rPr>
           <w:rFonts w:eastAsiaTheme="minorEastAsia"/>
           <w:lang w:val="uk-UA" w:eastAsia="ja-JP"/>
@@ -4048,7 +4269,7 @@
     </w:p>
     <w:p>
       <w:pPr>
-        <w:pStyle w:val="a"/>
+        <w:pStyle w:val="a0"/>
         <w:rPr>
           <w:rFonts w:eastAsiaTheme="minorEastAsia"/>
           <w:lang w:val="uk-UA" w:eastAsia="ja-JP"/>
@@ -4064,16 +4285,16 @@
     </w:p>
     <w:p>
       <w:pPr>
-        <w:pStyle w:val="a"/>
-        <w:rPr>
-          <w:rFonts w:eastAsiaTheme="minorEastAsia"/>
-          <w:lang w:val="uk-UA" w:eastAsia="ja-JP"/>
-        </w:rPr>
-      </w:pPr>
-    </w:p>
-    <w:p>
-      <w:pPr>
-        <w:pStyle w:val="a"/>
+        <w:pStyle w:val="a0"/>
+        <w:rPr>
+          <w:rFonts w:eastAsiaTheme="minorEastAsia"/>
+          <w:lang w:val="uk-UA" w:eastAsia="ja-JP"/>
+        </w:rPr>
+      </w:pPr>
+    </w:p>
+    <w:p>
+      <w:pPr>
+        <w:pStyle w:val="a0"/>
         <w:rPr>
           <w:rFonts w:eastAsiaTheme="minorEastAsia"/>
           <w:lang w:val="uk-UA" w:eastAsia="ja-JP"/>
@@ -4089,16 +4310,16 @@
     </w:p>
     <w:p>
       <w:pPr>
-        <w:pStyle w:val="a"/>
-        <w:rPr>
-          <w:rFonts w:eastAsiaTheme="minorEastAsia"/>
-          <w:lang w:val="uk-UA" w:eastAsia="ja-JP"/>
-        </w:rPr>
-      </w:pPr>
-    </w:p>
-    <w:p>
-      <w:pPr>
-        <w:pStyle w:val="a"/>
+        <w:pStyle w:val="a0"/>
+        <w:rPr>
+          <w:rFonts w:eastAsiaTheme="minorEastAsia"/>
+          <w:lang w:val="uk-UA" w:eastAsia="ja-JP"/>
+        </w:rPr>
+      </w:pPr>
+    </w:p>
+    <w:p>
+      <w:pPr>
+        <w:pStyle w:val="a0"/>
         <w:rPr>
           <w:rFonts w:eastAsiaTheme="minorEastAsia"/>
           <w:lang w:val="uk-UA" w:eastAsia="ja-JP"/>
@@ -4114,7 +4335,7 @@
     </w:p>
     <w:p>
       <w:pPr>
-        <w:pStyle w:val="a"/>
+        <w:pStyle w:val="a0"/>
         <w:rPr>
           <w:rFonts w:eastAsiaTheme="minorEastAsia"/>
           <w:lang w:val="uk-UA" w:eastAsia="ja-JP"/>
@@ -4130,7 +4351,7 @@
     </w:p>
     <w:p>
       <w:pPr>
-        <w:pStyle w:val="a"/>
+        <w:pStyle w:val="a0"/>
         <w:rPr>
           <w:rFonts w:eastAsiaTheme="minorEastAsia"/>
           <w:lang w:val="uk-UA" w:eastAsia="ja-JP"/>
@@ -4146,7 +4367,7 @@
     </w:p>
     <w:p>
       <w:pPr>
-        <w:pStyle w:val="a"/>
+        <w:pStyle w:val="a0"/>
         <w:rPr>
           <w:rFonts w:eastAsiaTheme="minorEastAsia"/>
           <w:lang w:val="uk-UA" w:eastAsia="ja-JP"/>
@@ -4162,16 +4383,16 @@
     </w:p>
     <w:p>
       <w:pPr>
-        <w:pStyle w:val="a"/>
-        <w:rPr>
-          <w:rFonts w:eastAsiaTheme="minorEastAsia"/>
-          <w:lang w:val="uk-UA" w:eastAsia="ja-JP"/>
-        </w:rPr>
-      </w:pPr>
-    </w:p>
-    <w:p>
-      <w:pPr>
-        <w:pStyle w:val="a"/>
+        <w:pStyle w:val="a0"/>
+        <w:rPr>
+          <w:rFonts w:eastAsiaTheme="minorEastAsia"/>
+          <w:lang w:val="uk-UA" w:eastAsia="ja-JP"/>
+        </w:rPr>
+      </w:pPr>
+    </w:p>
+    <w:p>
+      <w:pPr>
+        <w:pStyle w:val="a0"/>
         <w:rPr>
           <w:rFonts w:eastAsiaTheme="minorEastAsia"/>
           <w:lang w:val="uk-UA" w:eastAsia="ja-JP"/>
@@ -4187,7 +4408,7 @@
     </w:p>
     <w:p>
       <w:pPr>
-        <w:pStyle w:val="a"/>
+        <w:pStyle w:val="a0"/>
         <w:rPr>
           <w:rFonts w:eastAsiaTheme="minorEastAsia"/>
           <w:lang w:val="uk-UA" w:eastAsia="ja-JP"/>
@@ -4203,7 +4424,7 @@
     </w:p>
     <w:p>
       <w:pPr>
-        <w:pStyle w:val="a"/>
+        <w:pStyle w:val="a0"/>
         <w:rPr>
           <w:rFonts w:eastAsiaTheme="minorEastAsia"/>
           <w:lang w:val="uk-UA" w:eastAsia="ja-JP"/>
@@ -4219,7 +4440,7 @@
     </w:p>
     <w:p>
       <w:pPr>
-        <w:pStyle w:val="a"/>
+        <w:pStyle w:val="a0"/>
         <w:rPr>
           <w:rFonts w:eastAsiaTheme="minorEastAsia"/>
           <w:lang w:val="uk-UA" w:eastAsia="ja-JP"/>
@@ -4235,7 +4456,7 @@
     </w:p>
     <w:p>
       <w:pPr>
-        <w:pStyle w:val="a"/>
+        <w:pStyle w:val="a0"/>
         <w:rPr>
           <w:rFonts w:eastAsiaTheme="minorEastAsia"/>
           <w:lang w:val="uk-UA" w:eastAsia="ja-JP"/>
@@ -4251,16 +4472,16 @@
     </w:p>
     <w:p>
       <w:pPr>
-        <w:pStyle w:val="a"/>
-        <w:rPr>
-          <w:rFonts w:eastAsiaTheme="minorEastAsia"/>
-          <w:lang w:val="uk-UA" w:eastAsia="ja-JP"/>
-        </w:rPr>
-      </w:pPr>
-    </w:p>
-    <w:p>
-      <w:pPr>
-        <w:pStyle w:val="a"/>
+        <w:pStyle w:val="a0"/>
+        <w:rPr>
+          <w:rFonts w:eastAsiaTheme="minorEastAsia"/>
+          <w:lang w:val="uk-UA" w:eastAsia="ja-JP"/>
+        </w:rPr>
+      </w:pPr>
+    </w:p>
+    <w:p>
+      <w:pPr>
+        <w:pStyle w:val="a0"/>
         <w:rPr>
           <w:rFonts w:eastAsiaTheme="minorEastAsia"/>
           <w:lang w:val="uk-UA" w:eastAsia="ja-JP"/>
@@ -4276,7 +4497,7 @@
     </w:p>
     <w:p>
       <w:pPr>
-        <w:pStyle w:val="a"/>
+        <w:pStyle w:val="a0"/>
         <w:rPr>
           <w:rFonts w:eastAsiaTheme="minorEastAsia"/>
           <w:lang w:val="uk-UA" w:eastAsia="ja-JP"/>
@@ -4292,7 +4513,7 @@
     </w:p>
     <w:p>
       <w:pPr>
-        <w:pStyle w:val="a"/>
+        <w:pStyle w:val="a0"/>
         <w:rPr>
           <w:rFonts w:eastAsiaTheme="minorEastAsia"/>
           <w:lang w:val="uk-UA" w:eastAsia="ja-JP"/>
@@ -4308,7 +4529,7 @@
     </w:p>
     <w:p>
       <w:pPr>
-        <w:pStyle w:val="a"/>
+        <w:pStyle w:val="a0"/>
         <w:rPr>
           <w:rFonts w:eastAsiaTheme="minorEastAsia"/>
           <w:lang w:val="uk-UA" w:eastAsia="ja-JP"/>
@@ -4324,7 +4545,7 @@
     </w:p>
     <w:p>
       <w:pPr>
-        <w:pStyle w:val="a"/>
+        <w:pStyle w:val="a0"/>
         <w:rPr>
           <w:rFonts w:eastAsiaTheme="minorEastAsia"/>
           <w:lang w:val="uk-UA" w:eastAsia="ja-JP"/>
@@ -4340,7 +4561,7 @@
     </w:p>
     <w:p>
       <w:pPr>
-        <w:pStyle w:val="a"/>
+        <w:pStyle w:val="a0"/>
         <w:rPr>
           <w:rFonts w:eastAsiaTheme="minorEastAsia"/>
           <w:lang w:val="uk-UA" w:eastAsia="ja-JP"/>
@@ -4356,16 +4577,16 @@
     </w:p>
     <w:p>
       <w:pPr>
-        <w:pStyle w:val="a"/>
-        <w:rPr>
-          <w:rFonts w:eastAsiaTheme="minorEastAsia"/>
-          <w:lang w:val="uk-UA" w:eastAsia="ja-JP"/>
-        </w:rPr>
-      </w:pPr>
-    </w:p>
-    <w:p>
-      <w:pPr>
-        <w:pStyle w:val="a"/>
+        <w:pStyle w:val="a0"/>
+        <w:rPr>
+          <w:rFonts w:eastAsiaTheme="minorEastAsia"/>
+          <w:lang w:val="uk-UA" w:eastAsia="ja-JP"/>
+        </w:rPr>
+      </w:pPr>
+    </w:p>
+    <w:p>
+      <w:pPr>
+        <w:pStyle w:val="a0"/>
         <w:rPr>
           <w:rFonts w:eastAsiaTheme="minorEastAsia"/>
           <w:lang w:val="uk-UA" w:eastAsia="ja-JP"/>
@@ -4381,16 +4602,16 @@
     </w:p>
     <w:p>
       <w:pPr>
-        <w:pStyle w:val="a"/>
-        <w:rPr>
-          <w:rFonts w:eastAsiaTheme="minorEastAsia"/>
-          <w:lang w:val="uk-UA" w:eastAsia="ja-JP"/>
-        </w:rPr>
-      </w:pPr>
-    </w:p>
-    <w:p>
-      <w:pPr>
-        <w:pStyle w:val="a"/>
+        <w:pStyle w:val="a0"/>
+        <w:rPr>
+          <w:rFonts w:eastAsiaTheme="minorEastAsia"/>
+          <w:lang w:val="uk-UA" w:eastAsia="ja-JP"/>
+        </w:rPr>
+      </w:pPr>
+    </w:p>
+    <w:p>
+      <w:pPr>
+        <w:pStyle w:val="a0"/>
         <w:rPr>
           <w:rFonts w:eastAsiaTheme="minorEastAsia"/>
           <w:lang w:val="uk-UA" w:eastAsia="ja-JP"/>
@@ -4406,16 +4627,16 @@
     </w:p>
     <w:p>
       <w:pPr>
-        <w:pStyle w:val="a"/>
-        <w:rPr>
-          <w:rFonts w:eastAsiaTheme="minorEastAsia"/>
-          <w:lang w:val="uk-UA" w:eastAsia="ja-JP"/>
-        </w:rPr>
-      </w:pPr>
-    </w:p>
-    <w:p>
-      <w:pPr>
-        <w:pStyle w:val="a"/>
+        <w:pStyle w:val="a0"/>
+        <w:rPr>
+          <w:rFonts w:eastAsiaTheme="minorEastAsia"/>
+          <w:lang w:val="uk-UA" w:eastAsia="ja-JP"/>
+        </w:rPr>
+      </w:pPr>
+    </w:p>
+    <w:p>
+      <w:pPr>
+        <w:pStyle w:val="a0"/>
         <w:rPr>
           <w:rFonts w:eastAsiaTheme="minorEastAsia"/>
           <w:lang w:val="uk-UA" w:eastAsia="ja-JP"/>
@@ -4431,7 +4652,7 @@
     </w:p>
     <w:p>
       <w:pPr>
-        <w:pStyle w:val="a"/>
+        <w:pStyle w:val="a0"/>
         <w:rPr>
           <w:rFonts w:eastAsiaTheme="minorEastAsia"/>
           <w:lang w:val="uk-UA" w:eastAsia="ja-JP"/>
@@ -4447,7 +4668,7 @@
     </w:p>
     <w:p>
       <w:pPr>
-        <w:pStyle w:val="a"/>
+        <w:pStyle w:val="a0"/>
         <w:rPr>
           <w:rFonts w:eastAsiaTheme="minorEastAsia"/>
           <w:lang w:val="uk-UA" w:eastAsia="ja-JP"/>
@@ -4463,16 +4684,16 @@
     </w:p>
     <w:p>
       <w:pPr>
-        <w:pStyle w:val="a"/>
-        <w:rPr>
-          <w:rFonts w:eastAsiaTheme="minorEastAsia"/>
-          <w:lang w:val="uk-UA" w:eastAsia="ja-JP"/>
-        </w:rPr>
-      </w:pPr>
-    </w:p>
-    <w:p>
-      <w:pPr>
-        <w:pStyle w:val="a"/>
+        <w:pStyle w:val="a0"/>
+        <w:rPr>
+          <w:rFonts w:eastAsiaTheme="minorEastAsia"/>
+          <w:lang w:val="uk-UA" w:eastAsia="ja-JP"/>
+        </w:rPr>
+      </w:pPr>
+    </w:p>
+    <w:p>
+      <w:pPr>
+        <w:pStyle w:val="a0"/>
         <w:rPr>
           <w:rFonts w:eastAsiaTheme="minorEastAsia"/>
           <w:lang w:val="uk-UA" w:eastAsia="ja-JP"/>
@@ -4488,7 +4709,7 @@
     </w:p>
     <w:p>
       <w:pPr>
-        <w:pStyle w:val="a"/>
+        <w:pStyle w:val="a0"/>
         <w:rPr>
           <w:rFonts w:eastAsiaTheme="minorEastAsia"/>
           <w:lang w:val="uk-UA" w:eastAsia="ja-JP"/>
@@ -4504,7 +4725,7 @@
     </w:p>
     <w:p>
       <w:pPr>
-        <w:pStyle w:val="a"/>
+        <w:pStyle w:val="a0"/>
         <w:rPr>
           <w:rFonts w:eastAsiaTheme="minorEastAsia"/>
           <w:lang w:val="uk-UA" w:eastAsia="ja-JP"/>
@@ -4521,7 +4742,7 @@
     </w:p>
     <w:p>
       <w:pPr>
-        <w:pStyle w:val="a"/>
+        <w:pStyle w:val="a0"/>
         <w:rPr>
           <w:rFonts w:eastAsiaTheme="minorEastAsia"/>
           <w:lang w:val="uk-UA" w:eastAsia="ja-JP"/>
@@ -4537,16 +4758,16 @@
     </w:p>
     <w:p>
       <w:pPr>
-        <w:pStyle w:val="a"/>
-        <w:rPr>
-          <w:rFonts w:eastAsiaTheme="minorEastAsia"/>
-          <w:lang w:val="uk-UA" w:eastAsia="ja-JP"/>
-        </w:rPr>
-      </w:pPr>
-    </w:p>
-    <w:p>
-      <w:pPr>
-        <w:pStyle w:val="a"/>
+        <w:pStyle w:val="a0"/>
+        <w:rPr>
+          <w:rFonts w:eastAsiaTheme="minorEastAsia"/>
+          <w:lang w:val="uk-UA" w:eastAsia="ja-JP"/>
+        </w:rPr>
+      </w:pPr>
+    </w:p>
+    <w:p>
+      <w:pPr>
+        <w:pStyle w:val="a0"/>
         <w:rPr>
           <w:rFonts w:eastAsiaTheme="minorEastAsia"/>
           <w:lang w:val="uk-UA" w:eastAsia="ja-JP"/>
@@ -4562,16 +4783,16 @@
     </w:p>
     <w:p>
       <w:pPr>
-        <w:pStyle w:val="a"/>
-        <w:rPr>
-          <w:rFonts w:eastAsiaTheme="minorEastAsia"/>
-          <w:lang w:val="uk-UA" w:eastAsia="ja-JP"/>
-        </w:rPr>
-      </w:pPr>
-    </w:p>
-    <w:p>
-      <w:pPr>
-        <w:pStyle w:val="a"/>
+        <w:pStyle w:val="a0"/>
+        <w:rPr>
+          <w:rFonts w:eastAsiaTheme="minorEastAsia"/>
+          <w:lang w:val="uk-UA" w:eastAsia="ja-JP"/>
+        </w:rPr>
+      </w:pPr>
+    </w:p>
+    <w:p>
+      <w:pPr>
+        <w:pStyle w:val="a0"/>
         <w:rPr>
           <w:rFonts w:eastAsiaTheme="minorEastAsia"/>
           <w:lang w:val="uk-UA" w:eastAsia="ja-JP"/>
@@ -4587,7 +4808,7 @@
     </w:p>
     <w:p>
       <w:pPr>
-        <w:pStyle w:val="a"/>
+        <w:pStyle w:val="a0"/>
         <w:rPr>
           <w:rFonts w:eastAsiaTheme="minorEastAsia"/>
           <w:lang w:val="uk-UA" w:eastAsia="ja-JP"/>
@@ -4603,7 +4824,7 @@
     </w:p>
     <w:p>
       <w:pPr>
-        <w:pStyle w:val="a"/>
+        <w:pStyle w:val="a0"/>
         <w:rPr>
           <w:rFonts w:eastAsiaTheme="minorEastAsia"/>
           <w:lang w:val="uk-UA" w:eastAsia="ja-JP"/>
@@ -4619,7 +4840,7 @@
     </w:p>
     <w:p>
       <w:pPr>
-        <w:pStyle w:val="a"/>
+        <w:pStyle w:val="a0"/>
         <w:rPr>
           <w:rFonts w:eastAsiaTheme="minorEastAsia"/>
           <w:lang w:val="uk-UA" w:eastAsia="ja-JP"/>
@@ -4635,7 +4856,7 @@
     </w:p>
     <w:p>
       <w:pPr>
-        <w:pStyle w:val="a"/>
+        <w:pStyle w:val="a0"/>
         <w:rPr>
           <w:rFonts w:eastAsiaTheme="minorEastAsia"/>
           <w:lang w:val="uk-UA" w:eastAsia="ja-JP"/>
@@ -4651,16 +4872,16 @@
     </w:p>
     <w:p>
       <w:pPr>
-        <w:pStyle w:val="a"/>
-        <w:rPr>
-          <w:rFonts w:eastAsiaTheme="minorEastAsia"/>
-          <w:lang w:val="uk-UA" w:eastAsia="ja-JP"/>
-        </w:rPr>
-      </w:pPr>
-    </w:p>
-    <w:p>
-      <w:pPr>
-        <w:pStyle w:val="a"/>
+        <w:pStyle w:val="a0"/>
+        <w:rPr>
+          <w:rFonts w:eastAsiaTheme="minorEastAsia"/>
+          <w:lang w:val="uk-UA" w:eastAsia="ja-JP"/>
+        </w:rPr>
+      </w:pPr>
+    </w:p>
+    <w:p>
+      <w:pPr>
+        <w:pStyle w:val="a0"/>
         <w:rPr>
           <w:rFonts w:eastAsiaTheme="minorEastAsia"/>
           <w:lang w:val="uk-UA" w:eastAsia="ja-JP"/>
@@ -4676,7 +4897,7 @@
     </w:p>
     <w:p>
       <w:pPr>
-        <w:pStyle w:val="a"/>
+        <w:pStyle w:val="a0"/>
         <w:rPr>
           <w:rFonts w:eastAsiaTheme="minorEastAsia"/>
           <w:lang w:val="uk-UA" w:eastAsia="ja-JP"/>
@@ -4692,16 +4913,16 @@
     </w:p>
     <w:p>
       <w:pPr>
-        <w:pStyle w:val="a"/>
-        <w:rPr>
-          <w:rFonts w:eastAsiaTheme="minorEastAsia"/>
-          <w:lang w:val="uk-UA" w:eastAsia="ja-JP"/>
-        </w:rPr>
-      </w:pPr>
-    </w:p>
-    <w:p>
-      <w:pPr>
-        <w:pStyle w:val="a"/>
+        <w:pStyle w:val="a0"/>
+        <w:rPr>
+          <w:rFonts w:eastAsiaTheme="minorEastAsia"/>
+          <w:lang w:val="uk-UA" w:eastAsia="ja-JP"/>
+        </w:rPr>
+      </w:pPr>
+    </w:p>
+    <w:p>
+      <w:pPr>
+        <w:pStyle w:val="a0"/>
         <w:rPr>
           <w:rFonts w:eastAsiaTheme="minorEastAsia"/>
           <w:lang w:val="uk-UA" w:eastAsia="ja-JP"/>
@@ -4717,7 +4938,7 @@
     </w:p>
     <w:p>
       <w:pPr>
-        <w:pStyle w:val="a"/>
+        <w:pStyle w:val="a0"/>
         <w:rPr>
           <w:rFonts w:eastAsiaTheme="minorEastAsia"/>
           <w:lang w:val="uk-UA" w:eastAsia="ja-JP"/>
@@ -4733,16 +4954,16 @@
     </w:p>
     <w:p>
       <w:pPr>
-        <w:pStyle w:val="a"/>
-        <w:rPr>
-          <w:rFonts w:eastAsiaTheme="minorEastAsia"/>
-          <w:lang w:val="uk-UA" w:eastAsia="ja-JP"/>
-        </w:rPr>
-      </w:pPr>
-    </w:p>
-    <w:p>
-      <w:pPr>
-        <w:pStyle w:val="a"/>
+        <w:pStyle w:val="a0"/>
+        <w:rPr>
+          <w:rFonts w:eastAsiaTheme="minorEastAsia"/>
+          <w:lang w:val="uk-UA" w:eastAsia="ja-JP"/>
+        </w:rPr>
+      </w:pPr>
+    </w:p>
+    <w:p>
+      <w:pPr>
+        <w:pStyle w:val="a0"/>
         <w:rPr>
           <w:rFonts w:eastAsiaTheme="minorEastAsia"/>
           <w:lang w:val="uk-UA" w:eastAsia="ja-JP"/>
@@ -4758,16 +4979,16 @@
     </w:p>
     <w:p>
       <w:pPr>
-        <w:pStyle w:val="a"/>
-        <w:rPr>
-          <w:rFonts w:eastAsiaTheme="minorEastAsia"/>
-          <w:lang w:val="uk-UA" w:eastAsia="ja-JP"/>
-        </w:rPr>
-      </w:pPr>
-    </w:p>
-    <w:p>
-      <w:pPr>
-        <w:pStyle w:val="a"/>
+        <w:pStyle w:val="a0"/>
+        <w:rPr>
+          <w:rFonts w:eastAsiaTheme="minorEastAsia"/>
+          <w:lang w:val="uk-UA" w:eastAsia="ja-JP"/>
+        </w:rPr>
+      </w:pPr>
+    </w:p>
+    <w:p>
+      <w:pPr>
+        <w:pStyle w:val="a0"/>
         <w:rPr>
           <w:rFonts w:eastAsiaTheme="minorEastAsia"/>
           <w:lang w:val="uk-UA" w:eastAsia="ja-JP"/>
@@ -4783,16 +5004,16 @@
     </w:p>
     <w:p>
       <w:pPr>
-        <w:pStyle w:val="a"/>
-        <w:rPr>
-          <w:rFonts w:eastAsiaTheme="minorEastAsia"/>
-          <w:lang w:val="uk-UA" w:eastAsia="ja-JP"/>
-        </w:rPr>
-      </w:pPr>
-    </w:p>
-    <w:p>
-      <w:pPr>
-        <w:pStyle w:val="a"/>
+        <w:pStyle w:val="a0"/>
+        <w:rPr>
+          <w:rFonts w:eastAsiaTheme="minorEastAsia"/>
+          <w:lang w:val="uk-UA" w:eastAsia="ja-JP"/>
+        </w:rPr>
+      </w:pPr>
+    </w:p>
+    <w:p>
+      <w:pPr>
+        <w:pStyle w:val="a0"/>
         <w:rPr>
           <w:rFonts w:eastAsiaTheme="minorEastAsia"/>
           <w:lang w:val="uk-UA" w:eastAsia="ja-JP"/>
@@ -4808,7 +5029,7 @@
     </w:p>
     <w:p>
       <w:pPr>
-        <w:pStyle w:val="a"/>
+        <w:pStyle w:val="a0"/>
         <w:rPr>
           <w:rFonts w:eastAsiaTheme="minorEastAsia"/>
           <w:lang w:val="uk-UA" w:eastAsia="ja-JP"/>
@@ -4824,7 +5045,7 @@
     </w:p>
     <w:p>
       <w:pPr>
-        <w:pStyle w:val="a"/>
+        <w:pStyle w:val="a0"/>
         <w:rPr>
           <w:rFonts w:eastAsiaTheme="minorEastAsia"/>
           <w:lang w:val="uk-UA" w:eastAsia="ja-JP"/>
@@ -4840,7 +5061,7 @@
     </w:p>
     <w:p>
       <w:pPr>
-        <w:pStyle w:val="a"/>
+        <w:pStyle w:val="a0"/>
         <w:rPr>
           <w:rFonts w:eastAsiaTheme="minorEastAsia"/>
           <w:lang w:val="uk-UA" w:eastAsia="ja-JP"/>
@@ -4856,16 +5077,16 @@
     </w:p>
     <w:p>
       <w:pPr>
-        <w:pStyle w:val="a"/>
-        <w:rPr>
-          <w:rFonts w:eastAsiaTheme="minorEastAsia"/>
-          <w:lang w:val="uk-UA" w:eastAsia="ja-JP"/>
-        </w:rPr>
-      </w:pPr>
-    </w:p>
-    <w:p>
-      <w:pPr>
-        <w:pStyle w:val="a"/>
+        <w:pStyle w:val="a0"/>
+        <w:rPr>
+          <w:rFonts w:eastAsiaTheme="minorEastAsia"/>
+          <w:lang w:val="uk-UA" w:eastAsia="ja-JP"/>
+        </w:rPr>
+      </w:pPr>
+    </w:p>
+    <w:p>
+      <w:pPr>
+        <w:pStyle w:val="a0"/>
         <w:rPr>
           <w:rFonts w:eastAsiaTheme="minorEastAsia"/>
           <w:lang w:val="uk-UA" w:eastAsia="ja-JP"/>
@@ -4881,7 +5102,7 @@
     </w:p>
     <w:p>
       <w:pPr>
-        <w:pStyle w:val="a"/>
+        <w:pStyle w:val="a0"/>
         <w:rPr>
           <w:rFonts w:eastAsiaTheme="minorEastAsia"/>
           <w:lang w:val="uk-UA" w:eastAsia="ja-JP"/>
@@ -4897,7 +5118,7 @@
     </w:p>
     <w:p>
       <w:pPr>
-        <w:pStyle w:val="a"/>
+        <w:pStyle w:val="a0"/>
         <w:rPr>
           <w:rFonts w:eastAsiaTheme="minorEastAsia"/>
           <w:lang w:val="uk-UA" w:eastAsia="ja-JP"/>
@@ -4913,16 +5134,16 @@
     </w:p>
     <w:p>
       <w:pPr>
-        <w:pStyle w:val="a"/>
-        <w:rPr>
-          <w:rFonts w:eastAsiaTheme="minorEastAsia"/>
-          <w:lang w:val="uk-UA" w:eastAsia="ja-JP"/>
-        </w:rPr>
-      </w:pPr>
-    </w:p>
-    <w:p>
-      <w:pPr>
-        <w:pStyle w:val="a"/>
+        <w:pStyle w:val="a0"/>
+        <w:rPr>
+          <w:rFonts w:eastAsiaTheme="minorEastAsia"/>
+          <w:lang w:val="uk-UA" w:eastAsia="ja-JP"/>
+        </w:rPr>
+      </w:pPr>
+    </w:p>
+    <w:p>
+      <w:pPr>
+        <w:pStyle w:val="a0"/>
         <w:rPr>
           <w:rFonts w:eastAsiaTheme="minorEastAsia"/>
           <w:lang w:val="uk-UA" w:eastAsia="ja-JP"/>
@@ -4938,7 +5159,7 @@
     </w:p>
     <w:p>
       <w:pPr>
-        <w:pStyle w:val="a"/>
+        <w:pStyle w:val="a0"/>
         <w:rPr>
           <w:rFonts w:eastAsiaTheme="minorEastAsia"/>
           <w:lang w:val="uk-UA" w:eastAsia="ja-JP"/>
@@ -4954,7 +5175,7 @@
     </w:p>
     <w:p>
       <w:pPr>
-        <w:pStyle w:val="a"/>
+        <w:pStyle w:val="a0"/>
         <w:rPr>
           <w:rFonts w:eastAsiaTheme="minorEastAsia"/>
           <w:lang w:val="uk-UA" w:eastAsia="ja-JP"/>
@@ -4970,16 +5191,16 @@
     </w:p>
     <w:p>
       <w:pPr>
-        <w:pStyle w:val="a"/>
-        <w:rPr>
-          <w:rFonts w:eastAsiaTheme="minorEastAsia"/>
-          <w:lang w:val="uk-UA" w:eastAsia="ja-JP"/>
-        </w:rPr>
-      </w:pPr>
-    </w:p>
-    <w:p>
-      <w:pPr>
-        <w:pStyle w:val="a"/>
+        <w:pStyle w:val="a0"/>
+        <w:rPr>
+          <w:rFonts w:eastAsiaTheme="minorEastAsia"/>
+          <w:lang w:val="uk-UA" w:eastAsia="ja-JP"/>
+        </w:rPr>
+      </w:pPr>
+    </w:p>
+    <w:p>
+      <w:pPr>
+        <w:pStyle w:val="a0"/>
         <w:rPr>
           <w:rFonts w:eastAsiaTheme="minorEastAsia"/>
           <w:lang w:val="uk-UA" w:eastAsia="ja-JP"/>
@@ -4995,7 +5216,7 @@
     </w:p>
     <w:p>
       <w:pPr>
-        <w:pStyle w:val="a"/>
+        <w:pStyle w:val="a0"/>
         <w:rPr>
           <w:rFonts w:eastAsiaTheme="minorEastAsia"/>
           <w:lang w:val="uk-UA" w:eastAsia="ja-JP"/>
@@ -5011,7 +5232,7 @@
     </w:p>
     <w:p>
       <w:pPr>
-        <w:pStyle w:val="a"/>
+        <w:pStyle w:val="a0"/>
         <w:rPr>
           <w:rFonts w:eastAsiaTheme="minorEastAsia"/>
           <w:lang w:val="uk-UA" w:eastAsia="ja-JP"/>
@@ -5027,16 +5248,16 @@
     </w:p>
     <w:p>
       <w:pPr>
-        <w:pStyle w:val="a"/>
-        <w:rPr>
-          <w:rFonts w:eastAsiaTheme="minorEastAsia"/>
-          <w:lang w:val="uk-UA" w:eastAsia="ja-JP"/>
-        </w:rPr>
-      </w:pPr>
-    </w:p>
-    <w:p>
-      <w:pPr>
-        <w:pStyle w:val="a"/>
+        <w:pStyle w:val="a0"/>
+        <w:rPr>
+          <w:rFonts w:eastAsiaTheme="minorEastAsia"/>
+          <w:lang w:val="uk-UA" w:eastAsia="ja-JP"/>
+        </w:rPr>
+      </w:pPr>
+    </w:p>
+    <w:p>
+      <w:pPr>
+        <w:pStyle w:val="a0"/>
         <w:rPr>
           <w:rFonts w:eastAsiaTheme="minorEastAsia"/>
           <w:lang w:val="uk-UA" w:eastAsia="ja-JP"/>
@@ -5052,7 +5273,7 @@
     </w:p>
     <w:p>
       <w:pPr>
-        <w:pStyle w:val="a"/>
+        <w:pStyle w:val="a0"/>
         <w:rPr>
           <w:rFonts w:eastAsiaTheme="minorEastAsia"/>
           <w:lang w:val="uk-UA" w:eastAsia="ja-JP"/>
@@ -5068,7 +5289,7 @@
     </w:p>
     <w:p>
       <w:pPr>
-        <w:pStyle w:val="a"/>
+        <w:pStyle w:val="a0"/>
         <w:rPr>
           <w:rFonts w:eastAsiaTheme="minorEastAsia"/>
           <w:lang w:val="uk-UA" w:eastAsia="ja-JP"/>
@@ -5084,16 +5305,16 @@
     </w:p>
     <w:p>
       <w:pPr>
-        <w:pStyle w:val="a"/>
-        <w:rPr>
-          <w:rFonts w:eastAsiaTheme="minorEastAsia"/>
-          <w:lang w:val="uk-UA" w:eastAsia="ja-JP"/>
-        </w:rPr>
-      </w:pPr>
-    </w:p>
-    <w:p>
-      <w:pPr>
-        <w:pStyle w:val="a"/>
+        <w:pStyle w:val="a0"/>
+        <w:rPr>
+          <w:rFonts w:eastAsiaTheme="minorEastAsia"/>
+          <w:lang w:val="uk-UA" w:eastAsia="ja-JP"/>
+        </w:rPr>
+      </w:pPr>
+    </w:p>
+    <w:p>
+      <w:pPr>
+        <w:pStyle w:val="a0"/>
         <w:rPr>
           <w:rFonts w:eastAsiaTheme="minorEastAsia"/>
           <w:lang w:val="uk-UA" w:eastAsia="ja-JP"/>
@@ -5109,7 +5330,7 @@
     </w:p>
     <w:p>
       <w:pPr>
-        <w:pStyle w:val="a"/>
+        <w:pStyle w:val="a0"/>
         <w:rPr>
           <w:rFonts w:eastAsiaTheme="minorEastAsia"/>
           <w:lang w:val="uk-UA" w:eastAsia="ja-JP"/>
@@ -5125,7 +5346,7 @@
     </w:p>
     <w:p>
       <w:pPr>
-        <w:pStyle w:val="a"/>
+        <w:pStyle w:val="a0"/>
         <w:rPr>
           <w:rFonts w:eastAsiaTheme="minorEastAsia"/>
           <w:lang w:val="uk-UA" w:eastAsia="ja-JP"/>
@@ -5141,7 +5362,7 @@
     </w:p>
     <w:p>
       <w:pPr>
-        <w:pStyle w:val="a"/>
+        <w:pStyle w:val="a0"/>
         <w:rPr>
           <w:rFonts w:eastAsiaTheme="minorEastAsia"/>
           <w:lang w:val="uk-UA" w:eastAsia="ja-JP"/>
@@ -5157,16 +5378,16 @@
     </w:p>
     <w:p>
       <w:pPr>
-        <w:pStyle w:val="a"/>
-        <w:rPr>
-          <w:rFonts w:eastAsiaTheme="minorEastAsia"/>
-          <w:lang w:val="uk-UA" w:eastAsia="ja-JP"/>
-        </w:rPr>
-      </w:pPr>
-    </w:p>
-    <w:p>
-      <w:pPr>
-        <w:pStyle w:val="a"/>
+        <w:pStyle w:val="a0"/>
+        <w:rPr>
+          <w:rFonts w:eastAsiaTheme="minorEastAsia"/>
+          <w:lang w:val="uk-UA" w:eastAsia="ja-JP"/>
+        </w:rPr>
+      </w:pPr>
+    </w:p>
+    <w:p>
+      <w:pPr>
+        <w:pStyle w:val="a0"/>
         <w:rPr>
           <w:rFonts w:eastAsiaTheme="minorEastAsia"/>
           <w:lang w:val="uk-UA" w:eastAsia="ja-JP"/>
@@ -5182,16 +5403,16 @@
     </w:p>
     <w:p>
       <w:pPr>
-        <w:pStyle w:val="a"/>
-        <w:rPr>
-          <w:rFonts w:eastAsiaTheme="minorEastAsia"/>
-          <w:lang w:val="uk-UA" w:eastAsia="ja-JP"/>
-        </w:rPr>
-      </w:pPr>
-    </w:p>
-    <w:p>
-      <w:pPr>
-        <w:pStyle w:val="a"/>
+        <w:pStyle w:val="a0"/>
+        <w:rPr>
+          <w:rFonts w:eastAsiaTheme="minorEastAsia"/>
+          <w:lang w:val="uk-UA" w:eastAsia="ja-JP"/>
+        </w:rPr>
+      </w:pPr>
+    </w:p>
+    <w:p>
+      <w:pPr>
+        <w:pStyle w:val="a0"/>
         <w:rPr>
           <w:rFonts w:eastAsiaTheme="minorEastAsia"/>
           <w:lang w:val="uk-UA" w:eastAsia="ja-JP"/>
@@ -5207,7 +5428,7 @@
     </w:p>
     <w:p>
       <w:pPr>
-        <w:pStyle w:val="a"/>
+        <w:pStyle w:val="a0"/>
         <w:rPr>
           <w:rFonts w:eastAsiaTheme="minorEastAsia"/>
           <w:lang w:val="uk-UA" w:eastAsia="ja-JP"/>
@@ -5223,7 +5444,7 @@
     </w:p>
     <w:p>
       <w:pPr>
-        <w:pStyle w:val="a"/>
+        <w:pStyle w:val="a0"/>
         <w:rPr>
           <w:rFonts w:eastAsiaTheme="minorEastAsia"/>
           <w:lang w:val="uk-UA" w:eastAsia="ja-JP"/>
@@ -5239,16 +5460,16 @@
     </w:p>
     <w:p>
       <w:pPr>
-        <w:pStyle w:val="a"/>
-        <w:rPr>
-          <w:rFonts w:eastAsiaTheme="minorEastAsia"/>
-          <w:lang w:val="uk-UA" w:eastAsia="ja-JP"/>
-        </w:rPr>
-      </w:pPr>
-    </w:p>
-    <w:p>
-      <w:pPr>
-        <w:pStyle w:val="a"/>
+        <w:pStyle w:val="a0"/>
+        <w:rPr>
+          <w:rFonts w:eastAsiaTheme="minorEastAsia"/>
+          <w:lang w:val="uk-UA" w:eastAsia="ja-JP"/>
+        </w:rPr>
+      </w:pPr>
+    </w:p>
+    <w:p>
+      <w:pPr>
+        <w:pStyle w:val="a0"/>
         <w:rPr>
           <w:rFonts w:eastAsiaTheme="minorEastAsia"/>
           <w:lang w:val="uk-UA" w:eastAsia="ja-JP"/>
@@ -5264,7 +5485,7 @@
     </w:p>
     <w:p>
       <w:pPr>
-        <w:pStyle w:val="a"/>
+        <w:pStyle w:val="a0"/>
         <w:rPr>
           <w:rFonts w:eastAsiaTheme="minorEastAsia"/>
           <w:lang w:val="uk-UA" w:eastAsia="ja-JP"/>
@@ -5280,16 +5501,16 @@
     </w:p>
     <w:p>
       <w:pPr>
-        <w:pStyle w:val="a"/>
-        <w:rPr>
-          <w:rFonts w:eastAsiaTheme="minorEastAsia"/>
-          <w:lang w:val="uk-UA" w:eastAsia="ja-JP"/>
-        </w:rPr>
-      </w:pPr>
-    </w:p>
-    <w:p>
-      <w:pPr>
-        <w:pStyle w:val="a"/>
+        <w:pStyle w:val="a0"/>
+        <w:rPr>
+          <w:rFonts w:eastAsiaTheme="minorEastAsia"/>
+          <w:lang w:val="uk-UA" w:eastAsia="ja-JP"/>
+        </w:rPr>
+      </w:pPr>
+    </w:p>
+    <w:p>
+      <w:pPr>
+        <w:pStyle w:val="a0"/>
         <w:rPr>
           <w:rFonts w:eastAsiaTheme="minorEastAsia"/>
           <w:lang w:val="uk-UA" w:eastAsia="ja-JP"/>
@@ -5305,7 +5526,7 @@
     </w:p>
     <w:p>
       <w:pPr>
-        <w:pStyle w:val="a"/>
+        <w:pStyle w:val="a0"/>
         <w:rPr>
           <w:rFonts w:eastAsiaTheme="minorEastAsia"/>
           <w:lang w:val="uk-UA" w:eastAsia="ja-JP"/>
@@ -5322,16 +5543,16 @@
     </w:p>
     <w:p>
       <w:pPr>
-        <w:pStyle w:val="a"/>
-        <w:rPr>
-          <w:rFonts w:eastAsiaTheme="minorEastAsia"/>
-          <w:lang w:val="uk-UA" w:eastAsia="ja-JP"/>
-        </w:rPr>
-      </w:pPr>
-    </w:p>
-    <w:p>
-      <w:pPr>
-        <w:pStyle w:val="a"/>
+        <w:pStyle w:val="a0"/>
+        <w:rPr>
+          <w:rFonts w:eastAsiaTheme="minorEastAsia"/>
+          <w:lang w:val="uk-UA" w:eastAsia="ja-JP"/>
+        </w:rPr>
+      </w:pPr>
+    </w:p>
+    <w:p>
+      <w:pPr>
+        <w:pStyle w:val="a0"/>
         <w:rPr>
           <w:rFonts w:eastAsiaTheme="minorEastAsia"/>
           <w:lang w:val="uk-UA" w:eastAsia="ja-JP"/>
@@ -5347,7 +5568,7 @@
     </w:p>
     <w:p>
       <w:pPr>
-        <w:pStyle w:val="a"/>
+        <w:pStyle w:val="a0"/>
         <w:rPr>
           <w:rFonts w:eastAsiaTheme="minorEastAsia"/>
           <w:lang w:val="uk-UA" w:eastAsia="ja-JP"/>
@@ -5363,16 +5584,16 @@
     </w:p>
     <w:p>
       <w:pPr>
-        <w:pStyle w:val="a"/>
-        <w:rPr>
-          <w:rFonts w:eastAsiaTheme="minorEastAsia"/>
-          <w:lang w:val="uk-UA" w:eastAsia="ja-JP"/>
-        </w:rPr>
-      </w:pPr>
-    </w:p>
-    <w:p>
-      <w:pPr>
-        <w:pStyle w:val="a"/>
+        <w:pStyle w:val="a0"/>
+        <w:rPr>
+          <w:rFonts w:eastAsiaTheme="minorEastAsia"/>
+          <w:lang w:val="uk-UA" w:eastAsia="ja-JP"/>
+        </w:rPr>
+      </w:pPr>
+    </w:p>
+    <w:p>
+      <w:pPr>
+        <w:pStyle w:val="a0"/>
         <w:rPr>
           <w:rFonts w:eastAsiaTheme="minorEastAsia"/>
           <w:lang w:val="uk-UA" w:eastAsia="ja-JP"/>
@@ -5388,7 +5609,7 @@
     </w:p>
     <w:p>
       <w:pPr>
-        <w:pStyle w:val="a"/>
+        <w:pStyle w:val="a0"/>
         <w:rPr>
           <w:rFonts w:eastAsiaTheme="minorEastAsia"/>
           <w:lang w:val="uk-UA" w:eastAsia="ja-JP"/>
@@ -5404,16 +5625,16 @@
     </w:p>
     <w:p>
       <w:pPr>
-        <w:pStyle w:val="a"/>
-        <w:rPr>
-          <w:rFonts w:eastAsiaTheme="minorEastAsia"/>
-          <w:lang w:val="uk-UA" w:eastAsia="ja-JP"/>
-        </w:rPr>
-      </w:pPr>
-    </w:p>
-    <w:p>
-      <w:pPr>
-        <w:pStyle w:val="a"/>
+        <w:pStyle w:val="a0"/>
+        <w:rPr>
+          <w:rFonts w:eastAsiaTheme="minorEastAsia"/>
+          <w:lang w:val="uk-UA" w:eastAsia="ja-JP"/>
+        </w:rPr>
+      </w:pPr>
+    </w:p>
+    <w:p>
+      <w:pPr>
+        <w:pStyle w:val="a0"/>
         <w:rPr>
           <w:rFonts w:eastAsiaTheme="minorEastAsia"/>
           <w:lang w:val="uk-UA" w:eastAsia="ja-JP"/>
@@ -5429,7 +5650,7 @@
     </w:p>
     <w:p>
       <w:pPr>
-        <w:pStyle w:val="a"/>
+        <w:pStyle w:val="a0"/>
         <w:rPr>
           <w:rFonts w:eastAsiaTheme="minorEastAsia"/>
           <w:lang w:val="uk-UA" w:eastAsia="ja-JP"/>
@@ -5445,7 +5666,7 @@
     </w:p>
     <w:p>
       <w:pPr>
-        <w:pStyle w:val="a"/>
+        <w:pStyle w:val="a0"/>
         <w:rPr>
           <w:rFonts w:eastAsiaTheme="minorEastAsia"/>
           <w:lang w:val="uk-UA" w:eastAsia="ja-JP"/>
@@ -5461,16 +5682,16 @@
     </w:p>
     <w:p>
       <w:pPr>
-        <w:pStyle w:val="a"/>
-        <w:rPr>
-          <w:rFonts w:eastAsiaTheme="minorEastAsia"/>
-          <w:lang w:val="uk-UA" w:eastAsia="ja-JP"/>
-        </w:rPr>
-      </w:pPr>
-    </w:p>
-    <w:p>
-      <w:pPr>
-        <w:pStyle w:val="a"/>
+        <w:pStyle w:val="a0"/>
+        <w:rPr>
+          <w:rFonts w:eastAsiaTheme="minorEastAsia"/>
+          <w:lang w:val="uk-UA" w:eastAsia="ja-JP"/>
+        </w:rPr>
+      </w:pPr>
+    </w:p>
+    <w:p>
+      <w:pPr>
+        <w:pStyle w:val="a0"/>
         <w:rPr>
           <w:rFonts w:eastAsiaTheme="minorEastAsia"/>
           <w:lang w:val="uk-UA" w:eastAsia="ja-JP"/>
@@ -5486,16 +5707,16 @@
     </w:p>
     <w:p>
       <w:pPr>
-        <w:pStyle w:val="a"/>
-        <w:rPr>
-          <w:rFonts w:eastAsiaTheme="minorEastAsia"/>
-          <w:lang w:val="uk-UA" w:eastAsia="ja-JP"/>
-        </w:rPr>
-      </w:pPr>
-    </w:p>
-    <w:p>
-      <w:pPr>
-        <w:pStyle w:val="a"/>
+        <w:pStyle w:val="a0"/>
+        <w:rPr>
+          <w:rFonts w:eastAsiaTheme="minorEastAsia"/>
+          <w:lang w:val="uk-UA" w:eastAsia="ja-JP"/>
+        </w:rPr>
+      </w:pPr>
+    </w:p>
+    <w:p>
+      <w:pPr>
+        <w:pStyle w:val="a0"/>
         <w:rPr>
           <w:rFonts w:eastAsiaTheme="minorEastAsia"/>
           <w:lang w:val="uk-UA" w:eastAsia="ja-JP"/>
@@ -5511,16 +5732,16 @@
     </w:p>
     <w:p>
       <w:pPr>
-        <w:pStyle w:val="a"/>
-        <w:rPr>
-          <w:rFonts w:eastAsiaTheme="minorEastAsia"/>
-          <w:lang w:val="uk-UA" w:eastAsia="ja-JP"/>
-        </w:rPr>
-      </w:pPr>
-    </w:p>
-    <w:p>
-      <w:pPr>
-        <w:pStyle w:val="a"/>
+        <w:pStyle w:val="a0"/>
+        <w:rPr>
+          <w:rFonts w:eastAsiaTheme="minorEastAsia"/>
+          <w:lang w:val="uk-UA" w:eastAsia="ja-JP"/>
+        </w:rPr>
+      </w:pPr>
+    </w:p>
+    <w:p>
+      <w:pPr>
+        <w:pStyle w:val="a0"/>
         <w:rPr>
           <w:rFonts w:eastAsiaTheme="minorEastAsia"/>
           <w:lang w:val="uk-UA" w:eastAsia="ja-JP"/>
@@ -5536,16 +5757,16 @@
     </w:p>
     <w:p>
       <w:pPr>
-        <w:pStyle w:val="a"/>
-        <w:rPr>
-          <w:rFonts w:eastAsiaTheme="minorEastAsia"/>
-          <w:lang w:val="uk-UA" w:eastAsia="ja-JP"/>
-        </w:rPr>
-      </w:pPr>
-    </w:p>
-    <w:p>
-      <w:pPr>
-        <w:pStyle w:val="a"/>
+        <w:pStyle w:val="a0"/>
+        <w:rPr>
+          <w:rFonts w:eastAsiaTheme="minorEastAsia"/>
+          <w:lang w:val="uk-UA" w:eastAsia="ja-JP"/>
+        </w:rPr>
+      </w:pPr>
+    </w:p>
+    <w:p>
+      <w:pPr>
+        <w:pStyle w:val="a0"/>
         <w:rPr>
           <w:rFonts w:eastAsiaTheme="minorEastAsia"/>
           <w:lang w:val="uk-UA" w:eastAsia="ja-JP"/>
@@ -5561,7 +5782,7 @@
     </w:p>
     <w:p>
       <w:pPr>
-        <w:pStyle w:val="a"/>
+        <w:pStyle w:val="a0"/>
         <w:rPr>
           <w:rFonts w:eastAsiaTheme="minorEastAsia"/>
           <w:lang w:val="uk-UA" w:eastAsia="ja-JP"/>
@@ -5577,7 +5798,7 @@
     </w:p>
     <w:p>
       <w:pPr>
-        <w:pStyle w:val="a"/>
+        <w:pStyle w:val="a0"/>
         <w:rPr>
           <w:rFonts w:eastAsiaTheme="minorEastAsia"/>
           <w:lang w:val="uk-UA" w:eastAsia="ja-JP"/>
@@ -5593,16 +5814,16 @@
     </w:p>
     <w:p>
       <w:pPr>
-        <w:pStyle w:val="a"/>
-        <w:rPr>
-          <w:rFonts w:eastAsiaTheme="minorEastAsia"/>
-          <w:lang w:val="uk-UA" w:eastAsia="ja-JP"/>
-        </w:rPr>
-      </w:pPr>
-    </w:p>
-    <w:p>
-      <w:pPr>
-        <w:pStyle w:val="a"/>
+        <w:pStyle w:val="a0"/>
+        <w:rPr>
+          <w:rFonts w:eastAsiaTheme="minorEastAsia"/>
+          <w:lang w:val="uk-UA" w:eastAsia="ja-JP"/>
+        </w:rPr>
+      </w:pPr>
+    </w:p>
+    <w:p>
+      <w:pPr>
+        <w:pStyle w:val="a0"/>
         <w:rPr>
           <w:rFonts w:eastAsiaTheme="minorEastAsia"/>
           <w:lang w:val="uk-UA" w:eastAsia="ja-JP"/>
@@ -5618,7 +5839,7 @@
     </w:p>
     <w:p>
       <w:pPr>
-        <w:pStyle w:val="a"/>
+        <w:pStyle w:val="a0"/>
         <w:rPr>
           <w:rFonts w:eastAsiaTheme="minorEastAsia"/>
           <w:lang w:val="uk-UA" w:eastAsia="ja-JP"/>
@@ -5634,7 +5855,7 @@
     </w:p>
     <w:p>
       <w:pPr>
-        <w:pStyle w:val="a"/>
+        <w:pStyle w:val="a0"/>
         <w:rPr>
           <w:rFonts w:eastAsiaTheme="minorEastAsia"/>
           <w:lang w:val="uk-UA" w:eastAsia="ja-JP"/>
@@ -5650,7 +5871,7 @@
     </w:p>
     <w:p>
       <w:pPr>
-        <w:pStyle w:val="a"/>
+        <w:pStyle w:val="a0"/>
         <w:rPr>
           <w:rFonts w:eastAsiaTheme="minorEastAsia"/>
           <w:lang w:val="uk-UA" w:eastAsia="ja-JP"/>
@@ -5666,7 +5887,7 @@
     </w:p>
     <w:p>
       <w:pPr>
-        <w:pStyle w:val="a"/>
+        <w:pStyle w:val="a0"/>
         <w:rPr>
           <w:rFonts w:eastAsiaTheme="minorEastAsia"/>
           <w:lang w:val="uk-UA" w:eastAsia="ja-JP"/>
@@ -5682,16 +5903,16 @@
     </w:p>
     <w:p>
       <w:pPr>
-        <w:pStyle w:val="a"/>
-        <w:rPr>
-          <w:rFonts w:eastAsiaTheme="minorEastAsia"/>
-          <w:lang w:val="uk-UA" w:eastAsia="ja-JP"/>
-        </w:rPr>
-      </w:pPr>
-    </w:p>
-    <w:p>
-      <w:pPr>
-        <w:pStyle w:val="a"/>
+        <w:pStyle w:val="a0"/>
+        <w:rPr>
+          <w:rFonts w:eastAsiaTheme="minorEastAsia"/>
+          <w:lang w:val="uk-UA" w:eastAsia="ja-JP"/>
+        </w:rPr>
+      </w:pPr>
+    </w:p>
+    <w:p>
+      <w:pPr>
+        <w:pStyle w:val="a0"/>
         <w:rPr>
           <w:rFonts w:eastAsiaTheme="minorEastAsia"/>
           <w:lang w:val="uk-UA" w:eastAsia="ja-JP"/>
@@ -5748,16 +5969,16 @@
     </w:p>
     <w:p>
       <w:pPr>
-        <w:pStyle w:val="a"/>
-        <w:rPr>
-          <w:rFonts w:eastAsiaTheme="minorEastAsia"/>
-          <w:lang w:val="uk-UA" w:eastAsia="ja-JP"/>
-        </w:rPr>
-      </w:pPr>
-    </w:p>
-    <w:p>
-      <w:pPr>
-        <w:pStyle w:val="a"/>
+        <w:pStyle w:val="a0"/>
+        <w:rPr>
+          <w:rFonts w:eastAsiaTheme="minorEastAsia"/>
+          <w:lang w:val="uk-UA" w:eastAsia="ja-JP"/>
+        </w:rPr>
+      </w:pPr>
+    </w:p>
+    <w:p>
+      <w:pPr>
+        <w:pStyle w:val="a0"/>
         <w:rPr>
           <w:rFonts w:eastAsiaTheme="minorEastAsia"/>
           <w:lang w:val="uk-UA" w:eastAsia="ja-JP"/>
@@ -5773,7 +5994,7 @@
     </w:p>
     <w:p>
       <w:pPr>
-        <w:pStyle w:val="a"/>
+        <w:pStyle w:val="a0"/>
         <w:rPr>
           <w:rFonts w:eastAsiaTheme="minorEastAsia"/>
           <w:lang w:val="uk-UA" w:eastAsia="ja-JP"/>
@@ -5789,16 +6010,16 @@
     </w:p>
     <w:p>
       <w:pPr>
-        <w:pStyle w:val="a"/>
-        <w:rPr>
-          <w:rFonts w:eastAsiaTheme="minorEastAsia"/>
-          <w:lang w:val="uk-UA" w:eastAsia="ja-JP"/>
-        </w:rPr>
-      </w:pPr>
-    </w:p>
-    <w:p>
-      <w:pPr>
-        <w:pStyle w:val="a"/>
+        <w:pStyle w:val="a0"/>
+        <w:rPr>
+          <w:rFonts w:eastAsiaTheme="minorEastAsia"/>
+          <w:lang w:val="uk-UA" w:eastAsia="ja-JP"/>
+        </w:rPr>
+      </w:pPr>
+    </w:p>
+    <w:p>
+      <w:pPr>
+        <w:pStyle w:val="a0"/>
         <w:rPr>
           <w:rFonts w:eastAsiaTheme="minorEastAsia"/>
           <w:lang w:val="uk-UA" w:eastAsia="ja-JP"/>
@@ -5814,7 +6035,7 @@
     </w:p>
     <w:p>
       <w:pPr>
-        <w:pStyle w:val="a"/>
+        <w:pStyle w:val="a0"/>
         <w:rPr>
           <w:rFonts w:eastAsiaTheme="minorEastAsia"/>
           <w:lang w:val="uk-UA" w:eastAsia="ja-JP"/>
@@ -5830,7 +6051,7 @@
     </w:p>
     <w:p>
       <w:pPr>
-        <w:pStyle w:val="a"/>
+        <w:pStyle w:val="a0"/>
         <w:rPr>
           <w:rFonts w:eastAsiaTheme="minorEastAsia"/>
           <w:lang w:val="uk-UA" w:eastAsia="ja-JP"/>
@@ -5872,7 +6093,7 @@
     </w:p>
     <w:p>
       <w:pPr>
-        <w:pStyle w:val="a3"/>
+        <w:pStyle w:val="a4"/>
         <w:spacing w:before="0"/>
         <w:ind w:left="0"/>
       </w:pPr>
@@ -5936,7 +6157,7 @@
           </w:tcPr>
           <w:p>
             <w:pPr>
-              <w:pStyle w:val="a2"/>
+              <w:pStyle w:val="a3"/>
             </w:pPr>
             <w:r>
               <w:t>Тест</w:t>
@@ -5955,7 +6176,7 @@
           </w:tcPr>
           <w:p>
             <w:pPr>
-              <w:pStyle w:val="a2"/>
+              <w:pStyle w:val="a3"/>
             </w:pPr>
             <w:r>
               <w:t>Вихідні факти</w:t>
@@ -5974,7 +6195,7 @@
           </w:tcPr>
           <w:p>
             <w:pPr>
-              <w:pStyle w:val="a2"/>
+              <w:pStyle w:val="a3"/>
             </w:pPr>
             <w:r>
               <w:t>Ланцюг правил</w:t>
@@ -5993,7 +6214,7 @@
           </w:tcPr>
           <w:p>
             <w:pPr>
-              <w:pStyle w:val="a2"/>
+              <w:pStyle w:val="a3"/>
             </w:pPr>
             <w:r>
               <w:t>Отриманий висновок</w:t>
@@ -6015,7 +6236,7 @@
           </w:tcPr>
           <w:p>
             <w:pPr>
-              <w:pStyle w:val="a5"/>
+              <w:pStyle w:val="a6"/>
             </w:pPr>
             <w:r>
               <w:t>1</w:t>
@@ -6034,7 +6255,7 @@
           </w:tcPr>
           <w:p>
             <w:pPr>
-              <w:pStyle w:val="a2"/>
+              <w:pStyle w:val="a3"/>
             </w:pPr>
             <w:r>
               <w:t>Живлення = ні</w:t>
@@ -6053,7 +6274,7 @@
           </w:tcPr>
           <w:p>
             <w:pPr>
-              <w:pStyle w:val="a2"/>
+              <w:pStyle w:val="a3"/>
             </w:pPr>
             <w:r>
               <w:t>R1</w:t>
@@ -6069,7 +6290,7 @@
           </w:tcPr>
           <w:p>
             <w:pPr>
-              <w:pStyle w:val="a2"/>
+              <w:pStyle w:val="a3"/>
             </w:pPr>
             <w:r>
               <w:t>Проблема живлення</w:t>
@@ -6088,7 +6309,7 @@
           </w:tcPr>
           <w:p>
             <w:pPr>
-              <w:pStyle w:val="a5"/>
+              <w:pStyle w:val="a6"/>
             </w:pPr>
             <w:r>
               <w:t>2</w:t>
@@ -6104,7 +6325,7 @@
           </w:tcPr>
           <w:p>
             <w:pPr>
-              <w:pStyle w:val="a2"/>
+              <w:pStyle w:val="a3"/>
             </w:pPr>
             <w:r>
               <w:t>Живлення = так; вентилятори = так; сигнал дисплея = так; ОС = ні; диск = ні</w:t>
@@ -6120,7 +6341,7 @@
           </w:tcPr>
           <w:p>
             <w:pPr>
-              <w:pStyle w:val="a2"/>
+              <w:pStyle w:val="a3"/>
             </w:pPr>
             <w:r>
               <w:t>R3 → R5 → R6 → R7</w:t>
@@ -6133,7 +6354,7 @@
           </w:tcPr>
           <w:p>
             <w:pPr>
-              <w:pStyle w:val="a2"/>
+              <w:pStyle w:val="a3"/>
             </w:pPr>
             <w:r>
               <w:t>Проблема завантаження ОС; проблема накопичувача</w:t>
@@ -6151,7 +6372,7 @@
     </w:p>
     <w:p>
       <w:pPr>
-        <w:pStyle w:val="a3"/>
+        <w:pStyle w:val="a4"/>
         <w:spacing w:before="0"/>
         <w:ind w:left="0"/>
       </w:pPr>
@@ -6215,7 +6436,7 @@
           </w:tcPr>
           <w:p>
             <w:pPr>
-              <w:pStyle w:val="a2"/>
+              <w:pStyle w:val="a3"/>
             </w:pPr>
             <w:r>
               <w:t>Тест</w:t>
@@ -6234,7 +6455,7 @@
           </w:tcPr>
           <w:p>
             <w:pPr>
-              <w:pStyle w:val="a2"/>
+              <w:pStyle w:val="a3"/>
             </w:pPr>
             <w:r>
               <w:t>Вихідні факти</w:t>
@@ -6253,7 +6474,7 @@
           </w:tcPr>
           <w:p>
             <w:pPr>
-              <w:pStyle w:val="a2"/>
+              <w:pStyle w:val="a3"/>
             </w:pPr>
             <w:r>
               <w:t>Ланцюг правил</w:t>
@@ -6272,7 +6493,7 @@
           </w:tcPr>
           <w:p>
             <w:pPr>
-              <w:pStyle w:val="a2"/>
+              <w:pStyle w:val="a3"/>
             </w:pPr>
             <w:r>
               <w:t>Отриманий висновок</w:t>
@@ -6291,7 +6512,7 @@
           </w:tcPr>
           <w:p>
             <w:pPr>
-              <w:pStyle w:val="a5"/>
+              <w:pStyle w:val="a6"/>
             </w:pPr>
             <w:r>
               <w:lastRenderedPageBreak/>
@@ -6308,7 +6529,7 @@
           </w:tcPr>
           <w:p>
             <w:pPr>
-              <w:pStyle w:val="a2"/>
+              <w:pStyle w:val="a3"/>
             </w:pPr>
             <w:r>
               <w:t>Живлення = так; вентилятори = так; сигнал дисплея = так; ОС = так; мережа = ні</w:t>
@@ -6324,7 +6545,7 @@
           </w:tcPr>
           <w:p>
             <w:pPr>
-              <w:pStyle w:val="a2"/>
+              <w:pStyle w:val="a3"/>
             </w:pPr>
             <w:r>
               <w:t>R3 → R5 → R8 → R9</w:t>
@@ -6337,7 +6558,7 @@
           </w:tcPr>
           <w:p>
             <w:pPr>
-              <w:pStyle w:val="a2"/>
+              <w:pStyle w:val="a3"/>
             </w:pPr>
             <w:r>
               <w:t>Проблема мережевого підключення</w:t>
@@ -6704,7 +6925,7 @@
     </w:p>
     <w:p>
       <w:pPr>
-        <w:pStyle w:val="a6"/>
+        <w:pStyle w:val="a7"/>
         <w:spacing w:after="0"/>
       </w:pPr>
       <w:bookmarkStart w:id="10" w:name="_Toc242178477"/>
@@ -6727,6 +6948,417 @@
         <w:t>У лабораторній роботі розроблено експертну систему продукційного типу для первинної діагностики несправностей персонального комп’ютера. Сформовано базу знань з дев’яти правил, реалізовано робочу пам’ять, чергу FIFO та механізм прямого логічного виведення мовою Python. Система приймає вихідні факти, формує діагностичний висновок і відображає ланцюг правил, які привели до результату. Тестування показало коректне послідовне спрацювання правил і можливість одержання багатокрокових висновків.</w:t>
       </w:r>
     </w:p>
+    <w:p>
+      <w:pPr>
+        <w:pStyle w:val="a7"/>
+      </w:pPr>
+      <w:bookmarkStart w:id="11" w:name="_Toc246321708"/>
+      <w:bookmarkStart w:id="12" w:name="_Toc246321758"/>
+      <w:bookmarkStart w:id="13" w:name="_Toc246322853"/>
+      <w:bookmarkStart w:id="14" w:name="_Toc333773914"/>
+      <w:bookmarkStart w:id="15" w:name="_Toc195981303"/>
+      <w:bookmarkStart w:id="16" w:name="_Toc196031174"/>
+      <w:r>
+        <w:lastRenderedPageBreak/>
+        <w:t xml:space="preserve">Список </w:t>
+      </w:r>
+      <w:bookmarkEnd w:id="11"/>
+      <w:bookmarkEnd w:id="12"/>
+      <w:bookmarkEnd w:id="13"/>
+      <w:bookmarkEnd w:id="14"/>
+      <w:r>
+        <w:t>джерел інформації</w:t>
+      </w:r>
+      <w:bookmarkEnd w:id="15"/>
+      <w:bookmarkEnd w:id="16"/>
+    </w:p>
+    <w:p>
+      <w:pPr>
+        <w:pStyle w:val="a"/>
+      </w:pPr>
+      <w:r>
+        <w:t>Giarratano J. C., Riley G. D. Expert Systems: Principles and Programming. 4th ed. Thomson Course Technology, 2005.</w:t>
+      </w:r>
+    </w:p>
+    <w:p>
+      <w:pPr>
+        <w:pStyle w:val="a"/>
+      </w:pPr>
+      <w:r>
+        <w:t>Russell S. J., Norvig P. Artificial Intelligence: A Modern Approach. 4th ed. Pearson, 2021.</w:t>
+      </w:r>
+    </w:p>
+    <w:p>
+      <w:pPr>
+        <w:pStyle w:val="a"/>
+      </w:pPr>
+      <w:r>
+        <w:t xml:space="preserve">CLIPS. CLIPS Documentation. URL: </w:t>
+      </w:r>
+      <w:r>
+        <w:fldChar w:fldCharType="begin"/>
+      </w:r>
+      <w:r>
+        <w:instrText>HYPERLINK "https://www.clipsrules.net/Documentation.html"</w:instrText>
+      </w:r>
+      <w:r>
+        <w:fldChar w:fldCharType="separate"/>
+      </w:r>
+      <w:r>
+        <w:rPr>
+          <w:rStyle w:val="Hyperlink"/>
+        </w:rPr>
+        <w:t>https://www.clipsrules.net/Documentation.html</w:t>
+      </w:r>
+      <w:r>
+        <w:fldChar w:fldCharType="end"/>
+      </w:r>
+      <w:r>
+        <w:t xml:space="preserve"> (дата звернення: 13.10.2026).</w:t>
+      </w:r>
+    </w:p>
+    <w:p>
+      <w:pPr>
+        <w:pStyle w:val="a"/>
+      </w:pPr>
+      <w:r>
+        <w:t xml:space="preserve">Python Software Foundation. collections — Container datatypes. URL: </w:t>
+      </w:r>
+      <w:r>
+        <w:fldChar w:fldCharType="begin"/>
+      </w:r>
+      <w:r>
+        <w:instrText>HYPERLINK "https://docs.python.org/uk/3/library/collections.html"</w:instrText>
+      </w:r>
+      <w:r>
+        <w:fldChar w:fldCharType="separate"/>
+      </w:r>
+      <w:r>
+        <w:rPr>
+          <w:rStyle w:val="Hyperlink"/>
+        </w:rPr>
+        <w:t>https://docs.python.org/uk/3/library/collections.html</w:t>
+      </w:r>
+      <w:r>
+        <w:fldChar w:fldCharType="end"/>
+      </w:r>
+      <w:r>
+        <w:t xml:space="preserve"> (дата звернення: 13.10.2026).</w:t>
+      </w:r>
+    </w:p>
+    <w:p>
+      <w:pPr>
+        <w:pStyle w:val="a"/>
+      </w:pPr>
+      <w:r>
+        <w:t xml:space="preserve">Rule-Based Inference (Forward and Backward Chaining). Living Books. URL: </w:t>
+      </w:r>
+      <w:r>
+        <w:fldChar w:fldCharType="begin"/>
+      </w:r>
+      <w:r>
+        <w:instrText>HYPERLINK "https://living-book.github.io/atlas/concepts/ai-guide-to-intelligent-systems/rule-based-inference/"</w:instrText>
+      </w:r>
+      <w:r>
+        <w:fldChar w:fldCharType="separate"/>
+      </w:r>
+      <w:r>
+        <w:rPr>
+          <w:rStyle w:val="Hyperlink"/>
+        </w:rPr>
+        <w:t>https://living-book.github.io/atlas/concepts/ai-guide-to-intelligent-systems/rule-based-inference/</w:t>
+      </w:r>
+      <w:r>
+        <w:fldChar w:fldCharType="end"/>
+      </w:r>
+      <w:r>
+        <w:t xml:space="preserve"> (дата звернення: 13.10.2026).</w:t>
+      </w:r>
+    </w:p>
+    <w:p>
+      <w:pPr>
+        <w:pStyle w:val="a"/>
+      </w:pPr>
+      <w:r>
+        <w:t xml:space="preserve">Dell Technologies. Dell Support. URL: </w:t>
+      </w:r>
+      <w:r>
+        <w:fldChar w:fldCharType="begin"/>
+      </w:r>
+      <w:r>
+        <w:instrText>HYPERLINK "https://www.dell.com/support/home/"</w:instrText>
+      </w:r>
+      <w:r>
+        <w:fldChar w:fldCharType="separate"/>
+      </w:r>
+      <w:r>
+        <w:rPr>
+          <w:rStyle w:val="Hyperlink"/>
+        </w:rPr>
+        <w:t>https://www.dell.com/support/home/</w:t>
+      </w:r>
+      <w:r>
+        <w:fldChar w:fldCharType="end"/>
+      </w:r>
+      <w:r>
+        <w:t xml:space="preserve"> (дата звернення: 13.10.2026).</w:t>
+      </w:r>
+    </w:p>
+    <w:p>
+      <w:pPr>
+        <w:pStyle w:val="a"/>
+      </w:pPr>
+      <w:r>
+        <w:t xml:space="preserve">HP. HP Support. URL: </w:t>
+      </w:r>
+      <w:r>
+        <w:fldChar w:fldCharType="begin"/>
+      </w:r>
+      <w:r>
+        <w:instrText>HYPERLINK "https://support.hp.com/"</w:instrText>
+      </w:r>
+      <w:r>
+        <w:fldChar w:fldCharType="separate"/>
+      </w:r>
+      <w:r>
+        <w:rPr>
+          <w:rStyle w:val="Hyperlink"/>
+        </w:rPr>
+        <w:t>https://support.hp.com/</w:t>
+      </w:r>
+      <w:r>
+        <w:fldChar w:fldCharType="end"/>
+      </w:r>
+      <w:r>
+        <w:t xml:space="preserve"> (дата звернення: 13.10.2026).</w:t>
+      </w:r>
+    </w:p>
+    <w:p>
+      <w:pPr>
+        <w:pStyle w:val="a"/>
+      </w:pPr>
+      <w:r>
+        <w:t xml:space="preserve">Lenovo. Lenovo Support. URL: </w:t>
+      </w:r>
+      <w:r>
+        <w:fldChar w:fldCharType="begin"/>
+      </w:r>
+      <w:r>
+        <w:instrText>HYPERLINK "https://support.lenovo.com/"</w:instrText>
+      </w:r>
+      <w:r>
+        <w:fldChar w:fldCharType="separate"/>
+      </w:r>
+      <w:r>
+        <w:rPr>
+          <w:rStyle w:val="Hyperlink"/>
+        </w:rPr>
+        <w:t>https://support.lenovo.com/</w:t>
+      </w:r>
+      <w:r>
+        <w:fldChar w:fldCharType="end"/>
+      </w:r>
+      <w:r>
+        <w:t xml:space="preserve"> (дата звернення: 13.10.2026).</w:t>
+      </w:r>
+    </w:p>
+    <w:p>
+      <w:pPr>
+        <w:pStyle w:val="a"/>
+      </w:pPr>
+    </w:p>
+    <w:p>
+      <w:pPr>
+        <w:pStyle w:val="a"/>
+        <w:rPr>
+          <w:rStyle w:val="EndnoteReference"/>
+        </w:rPr>
+      </w:pPr>
+      <w:r>
+        <w:rPr>
+          <w:rStyle w:val="EndnoteReference"/>
+        </w:rPr>
+        <w:t xml:space="preserve">Безменов М. І. </w:t>
+      </w:r>
+      <w:proofErr w:type="spellStart"/>
+      <w:r>
+        <w:rPr>
+          <w:rStyle w:val="EndnoteReference"/>
+        </w:rPr>
+        <w:t>Вступ</w:t>
+      </w:r>
+      <w:proofErr w:type="spellEnd"/>
+      <w:r>
+        <w:rPr>
+          <w:rStyle w:val="EndnoteReference"/>
+        </w:rPr>
+        <w:t xml:space="preserve"> </w:t>
+      </w:r>
+      <w:proofErr w:type="spellStart"/>
+      <w:r>
+        <w:rPr>
+          <w:rStyle w:val="EndnoteReference"/>
+        </w:rPr>
+        <w:t>до</w:t>
+      </w:r>
+      <w:proofErr w:type="spellEnd"/>
+      <w:r>
+        <w:rPr>
+          <w:rStyle w:val="EndnoteReference"/>
+        </w:rPr>
+        <w:t xml:space="preserve"> Mathcad: </w:t>
+      </w:r>
+      <w:proofErr w:type="spellStart"/>
+      <w:r>
+        <w:rPr>
+          <w:rStyle w:val="EndnoteReference"/>
+        </w:rPr>
+        <w:t>навч</w:t>
+      </w:r>
+      <w:proofErr w:type="spellEnd"/>
+      <w:r>
+        <w:rPr>
+          <w:rStyle w:val="EndnoteReference"/>
+        </w:rPr>
+        <w:t>.-</w:t>
+      </w:r>
+      <w:proofErr w:type="spellStart"/>
+      <w:r>
+        <w:rPr>
+          <w:rStyle w:val="EndnoteReference"/>
+        </w:rPr>
+        <w:t>метод</w:t>
+      </w:r>
+      <w:proofErr w:type="spellEnd"/>
+      <w:r>
+        <w:rPr>
+          <w:rStyle w:val="EndnoteReference"/>
+        </w:rPr>
+        <w:t xml:space="preserve">. </w:t>
+      </w:r>
+      <w:proofErr w:type="spellStart"/>
+      <w:r>
+        <w:rPr>
+          <w:rStyle w:val="EndnoteReference"/>
+        </w:rPr>
+        <w:t>посіб</w:t>
+      </w:r>
+      <w:proofErr w:type="spellEnd"/>
+      <w:r>
+        <w:rPr>
+          <w:rStyle w:val="EndnoteReference"/>
+        </w:rPr>
+        <w:t xml:space="preserve">. </w:t>
+      </w:r>
+      <w:proofErr w:type="spellStart"/>
+      <w:r>
+        <w:rPr>
+          <w:rStyle w:val="EndnoteReference"/>
+        </w:rPr>
+        <w:t>Харків</w:t>
+      </w:r>
+      <w:proofErr w:type="spellEnd"/>
+      <w:r>
+        <w:rPr>
+          <w:rStyle w:val="EndnoteReference"/>
+        </w:rPr>
+        <w:t xml:space="preserve">: НТУ «ХПІ»; </w:t>
+      </w:r>
+      <w:proofErr w:type="spellStart"/>
+      <w:r>
+        <w:rPr>
+          <w:rStyle w:val="EndnoteReference"/>
+        </w:rPr>
+        <w:t>Планета-Прінт</w:t>
+      </w:r>
+      <w:proofErr w:type="spellEnd"/>
+      <w:r>
+        <w:rPr>
+          <w:rStyle w:val="EndnoteReference"/>
+        </w:rPr>
+        <w:t>», 2019. 68 с.</w:t>
+      </w:r>
+    </w:p>
+    <w:p>
+      <w:pPr>
+        <w:pStyle w:val="a"/>
+        <w:rPr>
+          <w:rFonts w:eastAsiaTheme="majorEastAsia"/>
+        </w:rPr>
+      </w:pPr>
+      <w:r>
+        <w:rPr>
+          <w:rFonts w:eastAsiaTheme="majorEastAsia"/>
+        </w:rPr>
+        <w:t xml:space="preserve">Goyal P., Ferrara E. Graph embedding techniques, applications, and performance: A survey. </w:t>
+      </w:r>
+      <w:r>
+        <w:t>Knowledge-Based Systems.</w:t>
+      </w:r>
+      <w:r>
+        <w:rPr>
+          <w:rFonts w:eastAsiaTheme="majorEastAsia"/>
+        </w:rPr>
+        <w:t xml:space="preserve"> 2018. Vol. 151. P. 78–94.</w:t>
+      </w:r>
+    </w:p>
+    <w:p>
+      <w:pPr>
+        <w:pStyle w:val="a"/>
+        <w:rPr>
+          <w:rFonts w:eastAsiaTheme="majorEastAsia"/>
+        </w:rPr>
+      </w:pPr>
+      <w:r>
+        <w:rPr>
+          <w:rFonts w:eastAsiaTheme="majorEastAsia"/>
+        </w:rPr>
+        <w:t xml:space="preserve">Куценко О. С., Безменов М. І. Ідентифікація лінійних динамічних систем у середовищі поліноміальних сигналів. </w:t>
+      </w:r>
+      <w:r>
+        <w:t>Вісник Національного технічного університету «ХПІ». Серія: Системний аналіз, управління та інформаційні технології.</w:t>
+      </w:r>
+      <w:r>
+        <w:rPr>
+          <w:rFonts w:eastAsiaTheme="majorEastAsia"/>
+        </w:rPr>
+        <w:t xml:space="preserve"> 2022. № 1 (7). С. 16–20.</w:t>
+      </w:r>
+    </w:p>
+    <w:p>
+      <w:pPr>
+        <w:pStyle w:val="a"/>
+      </w:pPr>
+      <w:r>
+        <w:rPr>
+          <w:rFonts w:eastAsiaTheme="majorEastAsia"/>
+        </w:rPr>
+        <w:lastRenderedPageBreak/>
+        <w:t xml:space="preserve">Різмонт Є. В., Безменов М. І. Використання конструктора Wix при розробці рекламного сайту. </w:t>
+      </w:r>
+      <w:r>
+        <w:t>ХІІІ Міжнар. наук.-практ. конф. магістрантів та аспірантів «Теоретичні та практичні дослідження молодих науковців» (19–22 листопада 2019 року): матеріали конф.</w:t>
+      </w:r>
+      <w:r>
+        <w:rPr>
+          <w:rFonts w:eastAsiaTheme="majorEastAsia"/>
+        </w:rPr>
+        <w:t xml:space="preserve"> Харків: НТУ «ХПІ», 2019. С. 131–132.</w:t>
+      </w:r>
+    </w:p>
+    <w:p>
+      <w:pPr>
+        <w:pStyle w:val="a"/>
+        <w:rPr>
+          <w:rStyle w:val="LightList-Accent6"/>
+          <w:color w:val="auto"/>
+        </w:rPr>
+      </w:pPr>
+      <w:r>
+        <w:t>Комп’ютерна графіка – визначення, основні принципи та важливість в сучасному світі. URL: https://mediacom.com.ua/kompyuterna-grafika-viznachennya-ta-osnovni-printsipi (дата звернення: 12.04.2025).</w:t>
+      </w:r>
+    </w:p>
+    <w:p/>
     <w:sectPr>
       <w:footerReference w:type="default" r:id="rId12"/>
       <w:pgSz w:w="12240" w:h="15840"/>
@@ -7011,6 +7643,185 @@
     </w:lvl>
   </w:abstractNum>
   <w:abstractNum w:abstractNumId="10" w15:restartNumberingAfterBreak="0">
+    <w:nsid w:val="192839F5"/>
+    <w:multiLevelType w:val="hybridMultilevel"/>
+    <w:tmpl w:val="92EA9BAC"/>
+    <w:lvl w:ilvl="0" w:tplc="B98CC512">
+      <w:start w:val="1"/>
+      <w:numFmt w:val="decimal"/>
+      <w:pStyle w:val="a"/>
+      <w:lvlText w:val="%1"/>
+      <w:lvlJc w:val="left"/>
+      <w:pPr>
+        <w:ind w:left="1429" w:hanging="360"/>
+      </w:pPr>
+      <w:rPr>
+        <w:rFonts w:hint="default"/>
+      </w:rPr>
+    </w:lvl>
+    <w:lvl w:ilvl="1" w:tplc="04090019" w:tentative="1">
+      <w:start w:val="1"/>
+      <w:numFmt w:val="lowerLetter"/>
+      <w:lvlText w:val="%2."/>
+      <w:lvlJc w:val="left"/>
+      <w:pPr>
+        <w:ind w:left="2149" w:hanging="360"/>
+      </w:pPr>
+    </w:lvl>
+    <w:lvl w:ilvl="2" w:tplc="0409001B" w:tentative="1">
+      <w:start w:val="1"/>
+      <w:numFmt w:val="lowerRoman"/>
+      <w:lvlText w:val="%3."/>
+      <w:lvlJc w:val="right"/>
+      <w:pPr>
+        <w:ind w:left="2869" w:hanging="180"/>
+      </w:pPr>
+    </w:lvl>
+    <w:lvl w:ilvl="3" w:tplc="0409000F" w:tentative="1">
+      <w:start w:val="1"/>
+      <w:numFmt w:val="decimal"/>
+      <w:lvlText w:val="%4."/>
+      <w:lvlJc w:val="left"/>
+      <w:pPr>
+        <w:ind w:left="3589" w:hanging="360"/>
+      </w:pPr>
+    </w:lvl>
+    <w:lvl w:ilvl="4" w:tplc="04090019" w:tentative="1">
+      <w:start w:val="1"/>
+      <w:numFmt w:val="lowerLetter"/>
+      <w:lvlText w:val="%5."/>
+      <w:lvlJc w:val="left"/>
+      <w:pPr>
+        <w:ind w:left="4309" w:hanging="360"/>
+      </w:pPr>
+    </w:lvl>
+    <w:lvl w:ilvl="5" w:tplc="0409001B" w:tentative="1">
+      <w:start w:val="1"/>
+      <w:numFmt w:val="lowerRoman"/>
+      <w:lvlText w:val="%6."/>
+      <w:lvlJc w:val="right"/>
+      <w:pPr>
+        <w:ind w:left="5029" w:hanging="180"/>
+      </w:pPr>
+    </w:lvl>
+    <w:lvl w:ilvl="6" w:tplc="0409000F" w:tentative="1">
+      <w:start w:val="1"/>
+      <w:numFmt w:val="decimal"/>
+      <w:lvlText w:val="%7."/>
+      <w:lvlJc w:val="left"/>
+      <w:pPr>
+        <w:ind w:left="5749" w:hanging="360"/>
+      </w:pPr>
+    </w:lvl>
+    <w:lvl w:ilvl="7" w:tplc="04090019" w:tentative="1">
+      <w:start w:val="1"/>
+      <w:numFmt w:val="lowerLetter"/>
+      <w:lvlText w:val="%8."/>
+      <w:lvlJc w:val="left"/>
+      <w:pPr>
+        <w:ind w:left="6469" w:hanging="360"/>
+      </w:pPr>
+    </w:lvl>
+    <w:lvl w:ilvl="8" w:tplc="0409001B" w:tentative="1">
+      <w:start w:val="1"/>
+      <w:numFmt w:val="lowerRoman"/>
+      <w:lvlText w:val="%9."/>
+      <w:lvlJc w:val="right"/>
+      <w:pPr>
+        <w:ind w:left="7189" w:hanging="180"/>
+      </w:pPr>
+    </w:lvl>
+  </w:abstractNum>
+  <w:abstractNum w:abstractNumId="11" w15:restartNumberingAfterBreak="0">
+    <w:nsid w:val="1A526EC1"/>
+    <w:multiLevelType w:val="hybridMultilevel"/>
+    <w:tmpl w:val="77683CAA"/>
+    <w:lvl w:ilvl="0" w:tplc="AA726F8C">
+      <w:start w:val="1"/>
+      <w:numFmt w:val="decimal"/>
+      <w:lvlText w:val="%1"/>
+      <w:lvlJc w:val="left"/>
+      <w:pPr>
+        <w:ind w:left="1571" w:hanging="360"/>
+      </w:pPr>
+      <w:rPr>
+        <w:rFonts w:hint="default"/>
+      </w:rPr>
+    </w:lvl>
+    <w:lvl w:ilvl="1" w:tplc="04090019" w:tentative="1">
+      <w:start w:val="1"/>
+      <w:numFmt w:val="lowerLetter"/>
+      <w:lvlText w:val="%2."/>
+      <w:lvlJc w:val="left"/>
+      <w:pPr>
+        <w:ind w:left="2291" w:hanging="360"/>
+      </w:pPr>
+    </w:lvl>
+    <w:lvl w:ilvl="2" w:tplc="0409001B" w:tentative="1">
+      <w:start w:val="1"/>
+      <w:numFmt w:val="lowerRoman"/>
+      <w:lvlText w:val="%3."/>
+      <w:lvlJc w:val="right"/>
+      <w:pPr>
+        <w:ind w:left="3011" w:hanging="180"/>
+      </w:pPr>
+    </w:lvl>
+    <w:lvl w:ilvl="3" w:tplc="0409000F" w:tentative="1">
+      <w:start w:val="1"/>
+      <w:numFmt w:val="decimal"/>
+      <w:lvlText w:val="%4."/>
+      <w:lvlJc w:val="left"/>
+      <w:pPr>
+        <w:ind w:left="3731" w:hanging="360"/>
+      </w:pPr>
+    </w:lvl>
+    <w:lvl w:ilvl="4" w:tplc="04090019" w:tentative="1">
+      <w:start w:val="1"/>
+      <w:numFmt w:val="lowerLetter"/>
+      <w:lvlText w:val="%5."/>
+      <w:lvlJc w:val="left"/>
+      <w:pPr>
+        <w:ind w:left="4451" w:hanging="360"/>
+      </w:pPr>
+    </w:lvl>
+    <w:lvl w:ilvl="5" w:tplc="0409001B" w:tentative="1">
+      <w:start w:val="1"/>
+      <w:numFmt w:val="lowerRoman"/>
+      <w:lvlText w:val="%6."/>
+      <w:lvlJc w:val="right"/>
+      <w:pPr>
+        <w:ind w:left="5171" w:hanging="180"/>
+      </w:pPr>
+    </w:lvl>
+    <w:lvl w:ilvl="6" w:tplc="0409000F" w:tentative="1">
+      <w:start w:val="1"/>
+      <w:numFmt w:val="decimal"/>
+      <w:lvlText w:val="%7."/>
+      <w:lvlJc w:val="left"/>
+      <w:pPr>
+        <w:ind w:left="5891" w:hanging="360"/>
+      </w:pPr>
+    </w:lvl>
+    <w:lvl w:ilvl="7" w:tplc="04090019" w:tentative="1">
+      <w:start w:val="1"/>
+      <w:numFmt w:val="lowerLetter"/>
+      <w:lvlText w:val="%8."/>
+      <w:lvlJc w:val="left"/>
+      <w:pPr>
+        <w:ind w:left="6611" w:hanging="360"/>
+      </w:pPr>
+    </w:lvl>
+    <w:lvl w:ilvl="8" w:tplc="0409001B" w:tentative="1">
+      <w:start w:val="1"/>
+      <w:numFmt w:val="lowerRoman"/>
+      <w:lvlText w:val="%9."/>
+      <w:lvlJc w:val="right"/>
+      <w:pPr>
+        <w:ind w:left="7331" w:hanging="180"/>
+      </w:pPr>
+    </w:lvl>
+  </w:abstractNum>
+  <w:abstractNum w:abstractNumId="12" w15:restartNumberingAfterBreak="0">
     <w:nsid w:val="54092E85"/>
     <w:multiLevelType w:val="hybridMultilevel"/>
     <w:tmpl w:val="D9B20E94"/>
@@ -7097,6 +7908,119 @@
       <w:lvlJc w:val="right"/>
       <w:pPr>
         <w:ind w:left="6480" w:hanging="180"/>
+      </w:pPr>
+    </w:lvl>
+  </w:abstractNum>
+  <w:abstractNum w:abstractNumId="13" w15:restartNumberingAfterBreak="0">
+    <w:nsid w:val="779854AF"/>
+    <w:multiLevelType w:val="multilevel"/>
+    <w:tmpl w:val="016CDC6C"/>
+    <w:lvl w:ilvl="0">
+      <w:start w:val="1"/>
+      <w:numFmt w:val="decimal"/>
+      <w:lvlText w:val="%1."/>
+      <w:lvlJc w:val="left"/>
+      <w:pPr>
+        <w:tabs>
+          <w:tab w:val="num" w:pos="720"/>
+        </w:tabs>
+        <w:ind w:left="720" w:hanging="360"/>
+      </w:pPr>
+    </w:lvl>
+    <w:lvl w:ilvl="1" w:tentative="1">
+      <w:start w:val="1"/>
+      <w:numFmt w:val="decimal"/>
+      <w:lvlText w:val="%2."/>
+      <w:lvlJc w:val="left"/>
+      <w:pPr>
+        <w:tabs>
+          <w:tab w:val="num" w:pos="1440"/>
+        </w:tabs>
+        <w:ind w:left="1440" w:hanging="360"/>
+      </w:pPr>
+    </w:lvl>
+    <w:lvl w:ilvl="2" w:tentative="1">
+      <w:start w:val="1"/>
+      <w:numFmt w:val="decimal"/>
+      <w:lvlText w:val="%3."/>
+      <w:lvlJc w:val="left"/>
+      <w:pPr>
+        <w:tabs>
+          <w:tab w:val="num" w:pos="2160"/>
+        </w:tabs>
+        <w:ind w:left="2160" w:hanging="360"/>
+      </w:pPr>
+    </w:lvl>
+    <w:lvl w:ilvl="3" w:tentative="1">
+      <w:start w:val="1"/>
+      <w:numFmt w:val="decimal"/>
+      <w:lvlText w:val="%4."/>
+      <w:lvlJc w:val="left"/>
+      <w:pPr>
+        <w:tabs>
+          <w:tab w:val="num" w:pos="2880"/>
+        </w:tabs>
+        <w:ind w:left="2880" w:hanging="360"/>
+      </w:pPr>
+    </w:lvl>
+    <w:lvl w:ilvl="4" w:tentative="1">
+      <w:start w:val="1"/>
+      <w:numFmt w:val="decimal"/>
+      <w:lvlText w:val="%5."/>
+      <w:lvlJc w:val="left"/>
+      <w:pPr>
+        <w:tabs>
+          <w:tab w:val="num" w:pos="3600"/>
+        </w:tabs>
+        <w:ind w:left="3600" w:hanging="360"/>
+      </w:pPr>
+    </w:lvl>
+    <w:lvl w:ilvl="5" w:tentative="1">
+      <w:start w:val="1"/>
+      <w:numFmt w:val="decimal"/>
+      <w:lvlText w:val="%6."/>
+      <w:lvlJc w:val="left"/>
+      <w:pPr>
+        <w:tabs>
+          <w:tab w:val="num" w:pos="4320"/>
+        </w:tabs>
+        <w:ind w:left="4320" w:hanging="360"/>
+      </w:pPr>
+    </w:lvl>
+    <w:lvl w:ilvl="6" w:tentative="1">
+      <w:start w:val="1"/>
+      <w:numFmt w:val="decimal"/>
+      <w:lvlText w:val="%7."/>
+      <w:lvlJc w:val="left"/>
+      <w:pPr>
+        <w:tabs>
+          <w:tab w:val="num" w:pos="5040"/>
+        </w:tabs>
+        <w:ind w:left="5040" w:hanging="360"/>
+      </w:pPr>
+    </w:lvl>
+    <w:lvl w:ilvl="7" w:tentative="1">
+      <w:start w:val="1"/>
+      <w:numFmt w:val="decimal"/>
+      <w:lvlText w:val="%8."/>
+      <w:lvlJc w:val="left"/>
+      <w:pPr>
+        <w:tabs>
+          <w:tab w:val="num" w:pos="5760"/>
+        </w:tabs>
+        <w:ind w:left="5760" w:hanging="360"/>
+      </w:pPr>
+    </w:lvl>
+    <w:lvl w:ilvl="8" w:tentative="1">
+      <w:start w:val="1"/>
+      <w:numFmt w:val="decimal"/>
+      <w:lvlText w:val="%9."/>
+      <w:lvlJc w:val="left"/>
+      <w:pPr>
+        <w:tabs>
+          <w:tab w:val="num" w:pos="6480"/>
+        </w:tabs>
+        <w:ind w:left="6480" w:hanging="360"/>
       </w:pPr>
     </w:lvl>
   </w:abstractNum>
@@ -7137,13 +8061,22 @@
     <w:abstractNumId w:val="0"/>
   </w:num>
   <w:num w:numId="13" w16cid:durableId="466968540">
-    <w:abstractNumId w:val="10"/>
+    <w:abstractNumId w:val="12"/>
   </w:num>
   <w:num w:numId="14" w16cid:durableId="639698407">
-    <w:abstractNumId w:val="10"/>
+    <w:abstractNumId w:val="12"/>
     <w:lvlOverride w:ilvl="0">
       <w:startOverride w:val="1"/>
     </w:lvlOverride>
+  </w:num>
+  <w:num w:numId="15" w16cid:durableId="32779054">
+    <w:abstractNumId w:val="11"/>
+  </w:num>
+  <w:num w:numId="16" w16cid:durableId="1851409412">
+    <w:abstractNumId w:val="10"/>
+  </w:num>
+  <w:num w:numId="17" w16cid:durableId="1237083480">
+    <w:abstractNumId w:val="13"/>
   </w:num>
 </w:numbering>
 </file>
@@ -7208,7 +8141,7 @@
     <w:lsdException w:name="annotation reference" w:semiHidden="1" w:unhideWhenUsed="1"/>
     <w:lsdException w:name="line number" w:semiHidden="1" w:unhideWhenUsed="1"/>
     <w:lsdException w:name="page number" w:semiHidden="1" w:unhideWhenUsed="1"/>
-    <w:lsdException w:name="endnote reference" w:semiHidden="1" w:unhideWhenUsed="1"/>
+    <w:lsdException w:name="endnote reference" w:semiHidden="1" w:uiPriority="0" w:unhideWhenUsed="1"/>
     <w:lsdException w:name="endnote text" w:semiHidden="1" w:unhideWhenUsed="1"/>
     <w:lsdException w:name="table of authorities" w:semiHidden="1" w:unhideWhenUsed="1"/>
     <w:lsdException w:name="macro" w:semiHidden="1" w:unhideWhenUsed="1"/>
@@ -18552,7 +19485,7 @@
       <w:sz w:val="16"/>
     </w:rPr>
   </w:style>
-  <w:style w:type="paragraph" w:customStyle="1" w:styleId="a">
+  <w:style w:type="paragraph" w:customStyle="1" w:styleId="a0">
     <w:name w:val="Текст програми"/>
     <w:autoRedefine/>
     <w:rsid w:val="004D0A0D"/>
@@ -18571,7 +19504,7 @@
       <w:lang w:eastAsia="ru-RU"/>
     </w:rPr>
   </w:style>
-  <w:style w:type="paragraph" w:customStyle="1" w:styleId="a0">
+  <w:style w:type="paragraph" w:customStyle="1" w:styleId="a1">
     <w:name w:val="Рисунок"/>
     <w:next w:val="Normal"/>
     <w:autoRedefine/>
@@ -18590,7 +19523,7 @@
       <w:lang w:val="uk-UA" w:eastAsia="ru-RU"/>
     </w:rPr>
   </w:style>
-  <w:style w:type="paragraph" w:customStyle="1" w:styleId="a1">
+  <w:style w:type="paragraph" w:customStyle="1" w:styleId="a2">
     <w:name w:val="Назва рисунку"/>
     <w:next w:val="Normal"/>
     <w:autoRedefine/>
@@ -18631,7 +19564,7 @@
       <w:u w:val="single"/>
     </w:rPr>
   </w:style>
-  <w:style w:type="paragraph" w:customStyle="1" w:styleId="a2">
+  <w:style w:type="paragraph" w:customStyle="1" w:styleId="a3">
     <w:name w:val="Текст таблиці (за центром)"/>
     <w:basedOn w:val="Normal"/>
     <w:rsid w:val="002A026B"/>
@@ -18646,7 +19579,7 @@
       <w:lang w:val="uk-UA" w:eastAsia="ru-RU"/>
     </w:rPr>
   </w:style>
-  <w:style w:type="paragraph" w:customStyle="1" w:styleId="a3">
+  <w:style w:type="paragraph" w:customStyle="1" w:styleId="a4">
     <w:name w:val="Назва таблиці"/>
     <w:basedOn w:val="Normal"/>
     <w:autoRedefine/>
@@ -18667,7 +19600,7 @@
       <w:lang w:val="uk-UA" w:eastAsia="ru-RU"/>
     </w:rPr>
   </w:style>
-  <w:style w:type="paragraph" w:customStyle="1" w:styleId="a4">
+  <w:style w:type="paragraph" w:customStyle="1" w:styleId="a5">
     <w:name w:val="Текст таблиці (за правим краєм)"/>
     <w:basedOn w:val="Normal"/>
     <w:autoRedefine/>
@@ -18682,7 +19615,7 @@
       <w:lang w:val="uk-UA" w:eastAsia="ru-RU"/>
     </w:rPr>
   </w:style>
-  <w:style w:type="paragraph" w:customStyle="1" w:styleId="a5">
+  <w:style w:type="paragraph" w:customStyle="1" w:styleId="a6">
     <w:name w:val="Текст таблиці (за лівим краєм)"/>
     <w:basedOn w:val="Normal"/>
     <w:autoRedefine/>
@@ -18699,7 +19632,7 @@
       <w:lang w:val="uk-UA" w:eastAsia="ru-RU"/>
     </w:rPr>
   </w:style>
-  <w:style w:type="paragraph" w:customStyle="1" w:styleId="a6">
+  <w:style w:type="paragraph" w:customStyle="1" w:styleId="a7">
     <w:name w:val="Заголовок без номера"/>
     <w:basedOn w:val="Heading1"/>
     <w:rsid w:val="00887D0B"/>
@@ -18715,6 +19648,76 @@
       <w:color w:val="auto"/>
       <w:szCs w:val="32"/>
       <w:lang w:val="uk-UA" w:eastAsia="ru-RU"/>
+    </w:rPr>
+  </w:style>
+  <w:style w:type="character" w:styleId="EndnoteReference">
+    <w:name w:val="endnote reference"/>
+    <w:rsid w:val="00372090"/>
+    <w:rPr>
+      <w:rFonts w:ascii="Times New Roman" w:hAnsi="Times New Roman"/>
+      <w:sz w:val="28"/>
+      <w:vertAlign w:val="baseline"/>
+    </w:rPr>
+  </w:style>
+  <w:style w:type="character" w:customStyle="1" w:styleId="a8">
+    <w:name w:val="Мова англійська"/>
+    <w:uiPriority w:val="1"/>
+    <w:rsid w:val="00372090"/>
+    <w:rPr>
+      <w:lang w:val="en-US"/>
+    </w:rPr>
+  </w:style>
+  <w:style w:type="paragraph" w:customStyle="1" w:styleId="a">
+    <w:name w:val="Список джерел"/>
+    <w:basedOn w:val="Normal"/>
+    <w:autoRedefine/>
+    <w:rsid w:val="009F3444"/>
+    <w:pPr>
+      <w:numPr>
+        <w:numId w:val="16"/>
+      </w:numPr>
+      <w:ind w:left="0" w:firstLine="720"/>
+    </w:pPr>
+    <w:rPr>
+      <w:rFonts w:cs="Times New Roman"/>
+      <w:snapToGrid w:val="0"/>
+      <w:color w:val="000000"/>
+      <w:szCs w:val="20"/>
+      <w:lang w:val="uk-UA" w:eastAsia="ru-RU"/>
+    </w:rPr>
+  </w:style>
+  <w:style w:type="character" w:customStyle="1" w:styleId="a9">
+    <w:name w:val="Курсив"/>
+    <w:rsid w:val="00372090"/>
+    <w:rPr>
+      <w:i/>
+    </w:rPr>
+  </w:style>
+  <w:style w:type="character" w:customStyle="1" w:styleId="aa">
+    <w:name w:val="Курсив (англ)"/>
+    <w:rsid w:val="00372090"/>
+    <w:rPr>
+      <w:i/>
+      <w:lang w:val="en-US"/>
+    </w:rPr>
+  </w:style>
+  <w:style w:type="paragraph" w:styleId="NormalWeb">
+    <w:name w:val="Normal (Web)"/>
+    <w:basedOn w:val="Normal"/>
+    <w:uiPriority w:val="99"/>
+    <w:semiHidden/>
+    <w:unhideWhenUsed/>
+    <w:rsid w:val="0082067C"/>
+    <w:pPr>
+      <w:spacing w:before="100" w:beforeAutospacing="1" w:after="100" w:afterAutospacing="1" w:line="240" w:lineRule="auto"/>
+      <w:ind w:firstLine="0"/>
+      <w:jc w:val="left"/>
+    </w:pPr>
+    <w:rPr>
+      <w:rFonts w:cs="Times New Roman"/>
+      <w:sz w:val="24"/>
+      <w:szCs w:val="24"/>
+      <w:lang w:eastAsia="ja-JP"/>
     </w:rPr>
   </w:style>
 </w:styles>
@@ -19041,11 +20044,11 @@
 </file>
 
 <file path=customXml/item1.xml><?xml version="1.0" encoding="utf-8"?>
-<b:Sources xmlns:b="http://schemas.openxmlformats.org/officeDocument/2006/bibliography" xmlns="http://schemas.openxmlformats.org/officeDocument/2006/bibliography" SelectedStyle="/APA.XSL" StyleName="APA"/>
+<b:Sources xmlns:b="http://schemas.openxmlformats.org/officeDocument/2006/bibliography" xmlns="http://schemas.openxmlformats.org/officeDocument/2006/bibliography" SelectedStyle="\APASixthEditionOfficeOnline.xsl" StyleName="APA" Version="6"/>
 </file>
 
 <file path=customXml/itemProps1.xml><?xml version="1.0" encoding="utf-8"?>
-<ds:datastoreItem xmlns:ds="http://schemas.openxmlformats.org/officeDocument/2006/customXml" ds:itemID="{EF278816-EC6F-A645-907D-7F25AECB1D4A}">
+<ds:datastoreItem xmlns:ds="http://schemas.openxmlformats.org/officeDocument/2006/customXml" ds:itemID="{4992E756-4B32-4CC9-9CF2-226160B8E6F1}">
   <ds:schemaRefs>
     <ds:schemaRef ds:uri="http://schemas.openxmlformats.org/officeDocument/2006/bibliography"/>
   </ds:schemaRefs>

</xml_diff>